<commit_message>
Fixed the seed.spec explanation
</commit_message>
<xml_diff>
--- a/הכשרת Playwright Agents.docx
+++ b/הכשרת Playwright Agents.docx
@@ -518,7 +518,7 @@
           <w:rtl/>
         </w:rPr>
       </w:pPr>
-      <w:bookmarkStart w:id="0" w:name="_Toc224653107"/>
+      <w:bookmarkStart w:id="0" w:name="_Toc224718578"/>
       <w:r>
         <w:rPr>
           <w:rFonts w:hint="cs"/>
@@ -586,7 +586,7 @@
           <w:r>
             <w:fldChar w:fldCharType="separate"/>
           </w:r>
-          <w:hyperlink w:anchor="_Toc224653107" w:history="1">
+          <w:hyperlink w:anchor="_Toc224718578" w:history="1">
             <w:r>
               <w:rPr>
                 <w:rStyle w:val="Hyperlink"/>
@@ -657,7 +657,7 @@
                 <w:noProof/>
                 <w:webHidden/>
               </w:rPr>
-              <w:instrText>Toc224653107 \h</w:instrText>
+              <w:instrText>Toc224718578 \h</w:instrText>
             </w:r>
             <w:r>
               <w:rPr>
@@ -714,7 +714,7 @@
               <w:rtl/>
             </w:rPr>
           </w:pPr>
-          <w:hyperlink w:anchor="_Toc224653108" w:history="1">
+          <w:hyperlink w:anchor="_Toc224718579" w:history="1">
             <w:r>
               <w:rPr>
                 <w:rStyle w:val="Hyperlink"/>
@@ -768,7 +768,7 @@
                 <w:noProof/>
                 <w:webHidden/>
               </w:rPr>
-              <w:instrText>Toc224653108 \h</w:instrText>
+              <w:instrText>Toc224718579 \h</w:instrText>
             </w:r>
             <w:r>
               <w:rPr>
@@ -825,7 +825,7 @@
               <w:rtl/>
             </w:rPr>
           </w:pPr>
-          <w:hyperlink w:anchor="_Toc224653109" w:history="1">
+          <w:hyperlink w:anchor="_Toc224718580" w:history="1">
             <w:r>
               <w:rPr>
                 <w:rStyle w:val="Hyperlink"/>
@@ -945,7 +945,7 @@
                 <w:noProof/>
                 <w:webHidden/>
               </w:rPr>
-              <w:instrText>Toc224653109 \h</w:instrText>
+              <w:instrText>Toc224718580 \h</w:instrText>
             </w:r>
             <w:r>
               <w:rPr>
@@ -1002,7 +1002,7 @@
               <w:rtl/>
             </w:rPr>
           </w:pPr>
-          <w:hyperlink w:anchor="_Toc224653110" w:history="1">
+          <w:hyperlink w:anchor="_Toc224718581" w:history="1">
             <w:r>
               <w:rPr>
                 <w:rStyle w:val="Hyperlink"/>
@@ -1056,7 +1056,7 @@
                 <w:noProof/>
                 <w:webHidden/>
               </w:rPr>
-              <w:instrText>Toc224653110 \h</w:instrText>
+              <w:instrText>Toc224718581 \h</w:instrText>
             </w:r>
             <w:r>
               <w:rPr>
@@ -1113,7 +1113,7 @@
               <w:rtl/>
             </w:rPr>
           </w:pPr>
-          <w:hyperlink w:anchor="_Toc224653111" w:history="1">
+          <w:hyperlink w:anchor="_Toc224718582" w:history="1">
             <w:r>
               <w:rPr>
                 <w:rStyle w:val="Hyperlink"/>
@@ -1165,7 +1165,7 @@
                 <w:noProof/>
                 <w:webHidden/>
               </w:rPr>
-              <w:instrText>Toc224653111 \h</w:instrText>
+              <w:instrText>Toc224718582 \h</w:instrText>
             </w:r>
             <w:r>
               <w:rPr>
@@ -1222,7 +1222,7 @@
               <w:rtl/>
             </w:rPr>
           </w:pPr>
-          <w:hyperlink w:anchor="_Toc224653112" w:history="1">
+          <w:hyperlink w:anchor="_Toc224718583" w:history="1">
             <w:r>
               <w:rPr>
                 <w:rStyle w:val="Hyperlink"/>
@@ -1274,7 +1274,7 @@
                 <w:noProof/>
                 <w:webHidden/>
               </w:rPr>
-              <w:instrText>Toc224653112 \h</w:instrText>
+              <w:instrText>Toc224718583 \h</w:instrText>
             </w:r>
             <w:r>
               <w:rPr>
@@ -1331,7 +1331,7 @@
               <w:rtl/>
             </w:rPr>
           </w:pPr>
-          <w:hyperlink w:anchor="_Toc224653113" w:history="1">
+          <w:hyperlink w:anchor="_Toc224718584" w:history="1">
             <w:r>
               <w:rPr>
                 <w:rStyle w:val="Hyperlink"/>
@@ -1383,7 +1383,7 @@
                 <w:noProof/>
                 <w:webHidden/>
               </w:rPr>
-              <w:instrText>Toc224653113 \h</w:instrText>
+              <w:instrText>Toc224718584 \h</w:instrText>
             </w:r>
             <w:r>
               <w:rPr>
@@ -1440,7 +1440,7 @@
               <w:rtl/>
             </w:rPr>
           </w:pPr>
-          <w:hyperlink w:anchor="_Toc224653114" w:history="1">
+          <w:hyperlink w:anchor="_Toc224718585" w:history="1">
             <w:r>
               <w:rPr>
                 <w:rStyle w:val="Hyperlink"/>
@@ -1511,7 +1511,7 @@
                 <w:noProof/>
                 <w:webHidden/>
               </w:rPr>
-              <w:instrText>Toc224653114 \h</w:instrText>
+              <w:instrText>Toc224718585 \h</w:instrText>
             </w:r>
             <w:r>
               <w:rPr>
@@ -1568,7 +1568,7 @@
               <w:rtl/>
             </w:rPr>
           </w:pPr>
-          <w:hyperlink w:anchor="_Toc224653115" w:history="1">
+          <w:hyperlink w:anchor="_Toc224718586" w:history="1">
             <w:r>
               <w:rPr>
                 <w:rStyle w:val="Hyperlink"/>
@@ -1622,7 +1622,7 @@
                 <w:noProof/>
                 <w:webHidden/>
               </w:rPr>
-              <w:instrText>Toc224653115 \h</w:instrText>
+              <w:instrText>Toc224718586 \h</w:instrText>
             </w:r>
             <w:r>
               <w:rPr>
@@ -1679,7 +1679,7 @@
               <w:rtl/>
             </w:rPr>
           </w:pPr>
-          <w:hyperlink w:anchor="_Toc224653116" w:history="1">
+          <w:hyperlink w:anchor="_Toc224718587" w:history="1">
             <w:r>
               <w:rPr>
                 <w:rStyle w:val="Hyperlink"/>
@@ -1731,7 +1731,7 @@
                 <w:noProof/>
                 <w:webHidden/>
               </w:rPr>
-              <w:instrText>Toc224653116 \h</w:instrText>
+              <w:instrText>Toc224718587 \h</w:instrText>
             </w:r>
             <w:r>
               <w:rPr>
@@ -1788,7 +1788,7 @@
               <w:rtl/>
             </w:rPr>
           </w:pPr>
-          <w:hyperlink w:anchor="_Toc224653117" w:history="1">
+          <w:hyperlink w:anchor="_Toc224718588" w:history="1">
             <w:r>
               <w:rPr>
                 <w:rStyle w:val="Hyperlink"/>
@@ -1908,7 +1908,7 @@
                 <w:noProof/>
                 <w:webHidden/>
               </w:rPr>
-              <w:instrText>Toc224653117 \h</w:instrText>
+              <w:instrText>Toc224718588 \h</w:instrText>
             </w:r>
             <w:r>
               <w:rPr>
@@ -1965,7 +1965,7 @@
               <w:rtl/>
             </w:rPr>
           </w:pPr>
-          <w:hyperlink w:anchor="_Toc224653118" w:history="1">
+          <w:hyperlink w:anchor="_Toc224718589" w:history="1">
             <w:r>
               <w:rPr>
                 <w:rStyle w:val="Hyperlink"/>
@@ -2087,7 +2087,7 @@
                 <w:noProof/>
                 <w:webHidden/>
               </w:rPr>
-              <w:instrText>Toc224653118 \h</w:instrText>
+              <w:instrText>Toc224718589 \h</w:instrText>
             </w:r>
             <w:r>
               <w:rPr>
@@ -2144,7 +2144,7 @@
               <w:rtl/>
             </w:rPr>
           </w:pPr>
-          <w:hyperlink w:anchor="_Toc224653119" w:history="1">
+          <w:hyperlink w:anchor="_Toc224718590" w:history="1">
             <w:r>
               <w:rPr>
                 <w:rStyle w:val="Hyperlink"/>
@@ -2232,7 +2232,7 @@
                 <w:noProof/>
                 <w:webHidden/>
               </w:rPr>
-              <w:instrText>Toc224653119 \h</w:instrText>
+              <w:instrText>Toc224718590 \h</w:instrText>
             </w:r>
             <w:r>
               <w:rPr>
@@ -2289,7 +2289,7 @@
               <w:rtl/>
             </w:rPr>
           </w:pPr>
-          <w:hyperlink w:anchor="_Toc224653120" w:history="1">
+          <w:hyperlink w:anchor="_Toc224718591" w:history="1">
             <w:r>
               <w:rPr>
                 <w:rStyle w:val="Hyperlink"/>
@@ -2377,7 +2377,7 @@
                 <w:noProof/>
                 <w:webHidden/>
               </w:rPr>
-              <w:instrText>Toc224653120 \h</w:instrText>
+              <w:instrText>Toc224718591 \h</w:instrText>
             </w:r>
             <w:r>
               <w:rPr>
@@ -2434,7 +2434,7 @@
               <w:rtl/>
             </w:rPr>
           </w:pPr>
-          <w:hyperlink w:anchor="_Toc224653121" w:history="1">
+          <w:hyperlink w:anchor="_Toc224718592" w:history="1">
             <w:r>
               <w:rPr>
                 <w:rStyle w:val="Hyperlink"/>
@@ -2488,7 +2488,7 @@
                 <w:noProof/>
                 <w:webHidden/>
               </w:rPr>
-              <w:instrText>Toc224653121 \h</w:instrText>
+              <w:instrText>Toc224718592 \h</w:instrText>
             </w:r>
             <w:r>
               <w:rPr>
@@ -2545,7 +2545,7 @@
               <w:rtl/>
             </w:rPr>
           </w:pPr>
-          <w:hyperlink w:anchor="_Toc224653122" w:history="1">
+          <w:hyperlink w:anchor="_Toc224718593" w:history="1">
             <w:r>
               <w:rPr>
                 <w:rStyle w:val="Hyperlink"/>
@@ -2597,7 +2597,7 @@
                 <w:noProof/>
                 <w:webHidden/>
               </w:rPr>
-              <w:instrText>Toc224653122 \h</w:instrText>
+              <w:instrText>Toc224718593 \h</w:instrText>
             </w:r>
             <w:r>
               <w:rPr>
@@ -2654,7 +2654,7 @@
               <w:rtl/>
             </w:rPr>
           </w:pPr>
-          <w:hyperlink w:anchor="_Toc224653123" w:history="1">
+          <w:hyperlink w:anchor="_Toc224718594" w:history="1">
             <w:r>
               <w:rPr>
                 <w:rStyle w:val="Hyperlink"/>
@@ -2708,7 +2708,7 @@
                 <w:noProof/>
                 <w:webHidden/>
               </w:rPr>
-              <w:instrText>Toc224653123 \h</w:instrText>
+              <w:instrText>Toc224718594 \h</w:instrText>
             </w:r>
             <w:r>
               <w:rPr>
@@ -2765,7 +2765,7 @@
               <w:rtl/>
             </w:rPr>
           </w:pPr>
-          <w:hyperlink w:anchor="_Toc224653124" w:history="1">
+          <w:hyperlink w:anchor="_Toc224718595" w:history="1">
             <w:r>
               <w:rPr>
                 <w:rStyle w:val="Hyperlink"/>
@@ -2853,7 +2853,7 @@
                 <w:noProof/>
                 <w:webHidden/>
               </w:rPr>
-              <w:instrText>Toc224653124 \h</w:instrText>
+              <w:instrText>Toc224718595 \h</w:instrText>
             </w:r>
             <w:r>
               <w:rPr>
@@ -2884,7 +2884,7 @@
                 <w:webHidden/>
                 <w:rtl/>
               </w:rPr>
-              <w:t>14</w:t>
+              <w:t>13</w:t>
             </w:r>
             <w:r>
               <w:rPr>
@@ -2910,7 +2910,7 @@
               <w:rtl/>
             </w:rPr>
           </w:pPr>
-          <w:hyperlink w:anchor="_Toc224653125" w:history="1">
+          <w:hyperlink w:anchor="_Toc224718596" w:history="1">
             <w:r>
               <w:rPr>
                 <w:rStyle w:val="Hyperlink"/>
@@ -3015,7 +3015,7 @@
                 <w:noProof/>
                 <w:webHidden/>
               </w:rPr>
-              <w:instrText>Toc224653125 \h</w:instrText>
+              <w:instrText>Toc224718596 \h</w:instrText>
             </w:r>
             <w:r>
               <w:rPr>
@@ -3072,7 +3072,7 @@
               <w:rtl/>
             </w:rPr>
           </w:pPr>
-          <w:hyperlink w:anchor="_Toc224653126" w:history="1">
+          <w:hyperlink w:anchor="_Toc224718597" w:history="1">
             <w:r>
               <w:rPr>
                 <w:rStyle w:val="Hyperlink"/>
@@ -3158,7 +3158,7 @@
                 <w:noProof/>
                 <w:webHidden/>
               </w:rPr>
-              <w:instrText>Toc224653126 \h</w:instrText>
+              <w:instrText>Toc224718597 \h</w:instrText>
             </w:r>
             <w:r>
               <w:rPr>
@@ -3215,7 +3215,7 @@
               <w:rtl/>
             </w:rPr>
           </w:pPr>
-          <w:hyperlink w:anchor="_Toc224653127" w:history="1">
+          <w:hyperlink w:anchor="_Toc224718598" w:history="1">
             <w:r>
               <w:rPr>
                 <w:rStyle w:val="Hyperlink"/>
@@ -3269,7 +3269,7 @@
                 <w:noProof/>
                 <w:webHidden/>
               </w:rPr>
-              <w:instrText>Toc224653127 \h</w:instrText>
+              <w:instrText>Toc224718598 \h</w:instrText>
             </w:r>
             <w:r>
               <w:rPr>
@@ -3300,7 +3300,7 @@
                 <w:webHidden/>
                 <w:rtl/>
               </w:rPr>
-              <w:t>16</w:t>
+              <w:t>15</w:t>
             </w:r>
             <w:r>
               <w:rPr>
@@ -3326,7 +3326,7 @@
               <w:rtl/>
             </w:rPr>
           </w:pPr>
-          <w:hyperlink w:anchor="_Toc224653128" w:history="1">
+          <w:hyperlink w:anchor="_Toc224718599" w:history="1">
             <w:r>
               <w:rPr>
                 <w:rStyle w:val="Hyperlink"/>
@@ -3412,7 +3412,7 @@
                 <w:noProof/>
                 <w:webHidden/>
               </w:rPr>
-              <w:instrText>Toc224653128 \h</w:instrText>
+              <w:instrText>Toc224718599 \h</w:instrText>
             </w:r>
             <w:r>
               <w:rPr>
@@ -3443,7 +3443,7 @@
                 <w:webHidden/>
                 <w:rtl/>
               </w:rPr>
-              <w:t>18</w:t>
+              <w:t>17</w:t>
             </w:r>
             <w:r>
               <w:rPr>
@@ -3517,7 +3517,7 @@
         </w:rPr>
       </w:pPr>
       <w:bookmarkStart w:id="1" w:name="_מבוא"/>
-      <w:bookmarkStart w:id="2" w:name="_Toc224653108"/>
+      <w:bookmarkStart w:id="2" w:name="_Toc224718579"/>
       <w:bookmarkEnd w:id="1"/>
       <w:r>
         <w:rPr>
@@ -4098,7 +4098,7 @@
         </w:rPr>
       </w:pPr>
       <w:bookmarkStart w:id="3" w:name="_עשרת_הדיברות_ל"/>
-      <w:bookmarkStart w:id="4" w:name="_Toc224653109"/>
+      <w:bookmarkStart w:id="4" w:name="_Toc224718580"/>
       <w:bookmarkEnd w:id="3"/>
       <w:r>
         <w:rPr>
@@ -5127,15 +5127,13 @@
     <w:p>
       <w:pPr>
         <w:rPr>
-          <w:rFonts w:hint="cs"/>
-          <w:rtl/>
-        </w:rPr>
-      </w:pPr>
-    </w:p>
-    <w:p>
-      <w:pPr>
-        <w:rPr>
-          <w:rFonts w:hint="cs"/>
+          <w:rtl/>
+        </w:rPr>
+      </w:pPr>
+    </w:p>
+    <w:p>
+      <w:pPr>
+        <w:rPr>
           <w:rtl/>
         </w:rPr>
       </w:pPr>
@@ -5240,7 +5238,7 @@
           <w:rtl/>
         </w:rPr>
       </w:pPr>
-      <w:bookmarkStart w:id="5" w:name="_Toc224653110"/>
+      <w:bookmarkStart w:id="5" w:name="_Toc224718581"/>
       <w:r>
         <w:rPr>
           <w:rFonts w:hint="cs"/>
@@ -5279,7 +5277,7 @@
       <w:pPr>
         <w:pStyle w:val="2"/>
       </w:pPr>
-      <w:bookmarkStart w:id="6" w:name="_Toc224653111"/>
+      <w:bookmarkStart w:id="6" w:name="_Toc224718582"/>
       <w:proofErr w:type="spellStart"/>
       <w:r>
         <w:t>VSCode</w:t>
@@ -5342,7 +5340,7 @@
       <w:pPr>
         <w:pStyle w:val="2"/>
       </w:pPr>
-      <w:bookmarkStart w:id="7" w:name="_Toc224653112"/>
+      <w:bookmarkStart w:id="7" w:name="_Toc224718583"/>
       <w:r>
         <w:t>Node.js</w:t>
       </w:r>
@@ -5387,7 +5385,7 @@
           <w:rtl/>
         </w:rPr>
       </w:pPr>
-      <w:bookmarkStart w:id="8" w:name="_Toc224653113"/>
+      <w:bookmarkStart w:id="8" w:name="_Toc224718584"/>
       <w:proofErr w:type="spellStart"/>
       <w:r>
         <w:t>OpenCode</w:t>
@@ -5491,15 +5489,7 @@
       </w:r>
       <w:proofErr w:type="spellEnd"/>
       <w:r>
-        <w:t xml:space="preserve"> </w:t>
-      </w:r>
-      <w:proofErr w:type="spellStart"/>
-      <w:r>
-        <w:t>i</w:t>
-      </w:r>
-      <w:proofErr w:type="spellEnd"/>
-      <w:r>
-        <w:t xml:space="preserve"> -g </w:t>
+        <w:t xml:space="preserve"> i -g </w:t>
       </w:r>
       <w:proofErr w:type="spellStart"/>
       <w:r>
@@ -5568,7 +5558,6 @@
     <w:p>
       <w:pPr>
         <w:rPr>
-          <w:rFonts w:hint="cs"/>
           <w:rtl/>
         </w:rPr>
       </w:pPr>
@@ -5605,7 +5594,7 @@
       <w:pPr>
         <w:pStyle w:val="1"/>
       </w:pPr>
-      <w:bookmarkStart w:id="10" w:name="_Toc224653114"/>
+      <w:bookmarkStart w:id="10" w:name="_Toc224718585"/>
       <w:r>
         <w:rPr>
           <w:rFonts w:hint="cs"/>
@@ -5624,7 +5613,7 @@
         </w:rPr>
       </w:pPr>
       <w:bookmarkStart w:id="11" w:name="_מבוא_1"/>
-      <w:bookmarkStart w:id="12" w:name="_Toc224653115"/>
+      <w:bookmarkStart w:id="12" w:name="_Toc224718586"/>
       <w:bookmarkEnd w:id="11"/>
       <w:r>
         <w:rPr>
@@ -5680,7 +5669,28 @@
           <w:rFonts w:hint="cs"/>
           <w:rtl/>
         </w:rPr>
-        <w:t xml:space="preserve"> (על פי ויקיפדיה) הוא למעשה </w:t>
+        <w:t xml:space="preserve">, </w:t>
+      </w:r>
+      <w:r>
+        <w:rPr>
+          <w:rFonts w:hint="cs"/>
+          <w:rtl/>
+        </w:rPr>
+        <w:t>על פי ויקיפדיה</w:t>
+      </w:r>
+      <w:r>
+        <w:rPr>
+          <w:rFonts w:hint="cs"/>
+          <w:rtl/>
+        </w:rPr>
+        <w:t xml:space="preserve">, </w:t>
+      </w:r>
+      <w:r>
+        <w:rPr>
+          <w:rFonts w:hint="cs"/>
+          <w:rtl/>
+        </w:rPr>
+        <w:t xml:space="preserve">הוא למעשה </w:t>
       </w:r>
       <w:r>
         <w:rPr>
@@ -6200,7 +6210,7 @@
       <w:pPr>
         <w:pStyle w:val="2"/>
       </w:pPr>
-      <w:bookmarkStart w:id="13" w:name="_Toc224653116"/>
+      <w:bookmarkStart w:id="13" w:name="_Toc224718587"/>
       <w:proofErr w:type="spellStart"/>
       <w:r>
         <w:lastRenderedPageBreak/>
@@ -6220,7 +6230,21 @@
           <w:rFonts w:hint="cs"/>
           <w:rtl/>
         </w:rPr>
-        <w:t>סוכן זה הוא בין הסוכנים העוצמתיים הקיימים היום ליצירת קוד על המחשב האישי שלנו, הפופולריות שלו נובעת מהשימוש הרחב שלו במגוון המודלים הקיימים היום בשוק (בניגוד לסוכנים שהם מתוך חברה מסוימת, המספקים רק את המודלים של החברה).</w:t>
+        <w:t>סוכן זה הוא בין הסוכנים העוצמתיים הקיימים היום ליצירת קוד על המחשב האישי שלנו, הפופולריות שלו נובעת מהשימוש הרחב שלו במגוון המודלים הקיימים היום בשוק</w:t>
+      </w:r>
+      <w:r>
+        <w:rPr>
+          <w:rFonts w:hint="cs"/>
+          <w:rtl/>
+        </w:rPr>
+        <w:t xml:space="preserve">, </w:t>
+      </w:r>
+      <w:r>
+        <w:rPr>
+          <w:rFonts w:hint="cs"/>
+          <w:rtl/>
+        </w:rPr>
+        <w:t>בניגוד לסוכנים שהם מתוך חברה מסוימת, המספקים רק את המודלים של החברה.</w:t>
       </w:r>
     </w:p>
     <w:p>
@@ -6335,7 +6359,7 @@
           <w:rtl/>
         </w:rPr>
       </w:pPr>
-      <w:bookmarkStart w:id="14" w:name="_Toc224653117"/>
+      <w:bookmarkStart w:id="14" w:name="_Toc224718588"/>
       <w:r>
         <w:rPr>
           <w:rFonts w:hint="cs"/>
@@ -6469,7 +6493,7 @@
           <w:rtl/>
         </w:rPr>
       </w:pPr>
-      <w:bookmarkStart w:id="15" w:name="_Toc224653118"/>
+      <w:bookmarkStart w:id="15" w:name="_Toc224718589"/>
       <w:r>
         <w:rPr>
           <w:rFonts w:hint="cs"/>
@@ -6654,7 +6678,14 @@
           <w:rFonts w:hint="cs"/>
           <w:rtl/>
         </w:rPr>
-        <w:t xml:space="preserve"> שיש היום (</w:t>
+        <w:t xml:space="preserve"> שיש היום</w:t>
+      </w:r>
+      <w:r>
+        <w:rPr>
+          <w:rFonts w:hint="cs"/>
+          <w:rtl/>
+        </w:rPr>
+        <w:t xml:space="preserve">, למשל כמו ל: </w:t>
       </w:r>
       <w:r>
         <w:t>Anthropic, OpenAI</w:t>
@@ -6664,7 +6695,27 @@
           <w:rFonts w:hint="cs"/>
           <w:rtl/>
         </w:rPr>
-        <w:t xml:space="preserve"> ועוד), יכול להתחבר עם המשתמש שלו על מנת </w:t>
+        <w:t xml:space="preserve"> ועוד</w:t>
+      </w:r>
+      <w:r>
+        <w:rPr>
+          <w:rFonts w:hint="cs"/>
+          <w:rtl/>
+        </w:rPr>
+        <w:t>...</w:t>
+      </w:r>
+      <w:r>
+        <w:rPr>
+          <w:rtl/>
+        </w:rPr>
+        <w:br/>
+      </w:r>
+      <w:r>
+        <w:rPr>
+          <w:rFonts w:hint="cs"/>
+          <w:rtl/>
+        </w:rPr>
+        <w:t xml:space="preserve">יכול להתחבר עם המשתמש שלו על מנת </w:t>
       </w:r>
       <w:r>
         <w:rPr>
@@ -7978,7 +8029,7 @@
           <w:rtl/>
         </w:rPr>
       </w:pPr>
-      <w:bookmarkStart w:id="16" w:name="_Toc224653119"/>
+      <w:bookmarkStart w:id="16" w:name="_Toc224718590"/>
       <w:r>
         <w:rPr>
           <w:rFonts w:hint="cs"/>
@@ -8266,7 +8317,7 @@
           <w:rtl/>
         </w:rPr>
       </w:pPr>
-      <w:bookmarkStart w:id="17" w:name="_Toc224653120"/>
+      <w:bookmarkStart w:id="17" w:name="_Toc224718591"/>
       <w:r>
         <w:rPr>
           <w:rFonts w:hint="cs"/>
@@ -8646,7 +8697,7 @@
           <w:rtl/>
         </w:rPr>
       </w:pPr>
-      <w:bookmarkStart w:id="18" w:name="_Toc224653121"/>
+      <w:bookmarkStart w:id="18" w:name="_Toc224718592"/>
       <w:r>
         <w:rPr>
           <w:rFonts w:hint="cs"/>
@@ -9346,7 +9397,7 @@
       <w:pPr>
         <w:pStyle w:val="2"/>
       </w:pPr>
-      <w:bookmarkStart w:id="19" w:name="_Toc224653122"/>
+      <w:bookmarkStart w:id="19" w:name="_Toc224718593"/>
       <w:r>
         <w:lastRenderedPageBreak/>
         <w:t>Playwright Agents</w:t>
@@ -9593,7 +9644,7 @@
           <w:rtl/>
         </w:rPr>
       </w:pPr>
-      <w:bookmarkStart w:id="20" w:name="_Toc224653123"/>
+      <w:bookmarkStart w:id="20" w:name="_Toc224718594"/>
       <w:r>
         <w:rPr>
           <w:rFonts w:hint="cs"/>
@@ -9812,63 +9863,28 @@
           <w:rFonts w:hint="cs"/>
           <w:rtl/>
         </w:rPr>
-        <w:t xml:space="preserve"> במידה ויש לכם תשתית קיימת, אתם מעבירים לקובץ הזה בדיקות קיימות</w:t>
-      </w:r>
-      <w:r>
-        <w:rPr>
-          <w:rFonts w:hint="cs"/>
-          <w:rtl/>
-        </w:rPr>
-        <w:t>, בהתאם למה שאתם רוצים לבדוק</w:t>
-      </w:r>
-      <w:r>
-        <w:rPr>
-          <w:rFonts w:hint="cs"/>
-          <w:rtl/>
-        </w:rPr>
-        <w:t xml:space="preserve">, </w:t>
-      </w:r>
-      <w:r>
-        <w:rPr>
-          <w:rFonts w:hint="cs"/>
-          <w:rtl/>
-        </w:rPr>
-        <w:t xml:space="preserve">הסוכן </w:t>
-      </w:r>
-      <w:r>
-        <w:rPr>
-          <w:rFonts w:hint="cs"/>
-          <w:rtl/>
-        </w:rPr>
-        <w:t>יריץ</w:t>
-      </w:r>
-      <w:r>
-        <w:rPr>
-          <w:rFonts w:hint="cs"/>
-          <w:rtl/>
-        </w:rPr>
-        <w:t xml:space="preserve"> את הבדיקות האלו</w:t>
-      </w:r>
-      <w:r>
-        <w:rPr>
-          <w:rFonts w:hint="cs"/>
-          <w:rtl/>
-        </w:rPr>
-        <w:t>, על מנת</w:t>
-      </w:r>
-      <w:r>
-        <w:rPr>
-          <w:rFonts w:hint="cs"/>
-          <w:rtl/>
-        </w:rPr>
-        <w:t xml:space="preserve"> להיכנס למערכת ולחקור אותה</w:t>
-      </w:r>
-      <w:r>
-        <w:rPr>
-          <w:rFonts w:hint="cs"/>
-          <w:rtl/>
-        </w:rPr>
-        <w:t xml:space="preserve">, פירוט של קובץ זה יהיה </w:t>
+        <w:t xml:space="preserve"> </w:t>
+      </w:r>
+      <w:r>
+        <w:rPr>
+          <w:rFonts w:hint="cs"/>
+          <w:rtl/>
+        </w:rPr>
+        <w:t xml:space="preserve">פירוט על קובץ </w:t>
+      </w:r>
+      <w:r>
+        <w:rPr>
+          <w:rFonts w:hint="cs"/>
+          <w:rtl/>
+        </w:rPr>
+        <w:t xml:space="preserve">זה </w:t>
+      </w:r>
+      <w:r>
+        <w:rPr>
+          <w:rFonts w:hint="cs"/>
+          <w:rtl/>
+        </w:rPr>
+        <w:t xml:space="preserve">יהיה </w:t>
       </w:r>
       <w:hyperlink w:anchor="_קובץ_ה_-" w:history="1">
         <w:r>
@@ -9877,23 +9893,7 @@
             <w:rFonts w:hint="cs"/>
             <w:rtl/>
           </w:rPr>
-          <w:t>כ</w:t>
-        </w:r>
-        <w:r>
-          <w:rPr>
-            <w:rStyle w:val="Hyperlink"/>
-            <w:rFonts w:hint="cs"/>
-            <w:rtl/>
-          </w:rPr>
-          <w:t>א</w:t>
-        </w:r>
-        <w:r>
-          <w:rPr>
-            <w:rStyle w:val="Hyperlink"/>
-            <w:rFonts w:hint="cs"/>
-            <w:rtl/>
-          </w:rPr>
-          <w:t>ן</w:t>
+          <w:t>כאן</w:t>
         </w:r>
       </w:hyperlink>
     </w:p>
@@ -10396,7 +10396,6 @@
     <w:p>
       <w:pPr>
         <w:rPr>
-          <w:rFonts w:hint="cs"/>
           <w:rtl/>
         </w:rPr>
       </w:pPr>
@@ -10502,7 +10501,6 @@
     <w:p>
       <w:pPr>
         <w:rPr>
-          <w:rFonts w:hint="cs"/>
           <w:rtl/>
         </w:rPr>
       </w:pPr>
@@ -10673,7 +10671,7 @@
       <w:pPr>
         <w:pStyle w:val="4"/>
         <w:rPr>
-          <w:rFonts w:cs="Arial" w:hint="cs"/>
+          <w:rFonts w:cs="Arial"/>
           <w:rtl/>
         </w:rPr>
       </w:pPr>
@@ -10941,7 +10939,6 @@
           <w:rFonts w:hint="cs"/>
           <w:rtl/>
         </w:rPr>
-        <w:lastRenderedPageBreak/>
         <w:t>מה הוא יבצע:</w:t>
       </w:r>
     </w:p>
@@ -10958,6 +10955,7 @@
           <w:rFonts w:hint="cs"/>
           <w:rtl/>
         </w:rPr>
+        <w:lastRenderedPageBreak/>
         <w:t>סורק את קובץ החוקים שניתן לו בתשתית</w:t>
       </w:r>
     </w:p>
@@ -11260,7 +11258,6 @@
     <w:p>
       <w:pPr>
         <w:rPr>
-          <w:rFonts w:hint="cs"/>
           <w:rtl/>
         </w:rPr>
       </w:pPr>
@@ -11315,13 +11312,7 @@
         </w:rPr>
       </w:pPr>
       <w:r>
-        <w:t xml:space="preserve">You are a Playwright Test </w:t>
-      </w:r>
-      <w:r>
-        <w:t>Generator</w:t>
-      </w:r>
-      <w:r>
-        <w:t xml:space="preserve"> Agent</w:t>
+        <w:t>You are a Playwright Test Generator Agent</w:t>
       </w:r>
       <w:r>
         <w:rPr>
@@ -11346,7 +11337,6 @@
     <w:p>
       <w:pPr>
         <w:rPr>
-          <w:rFonts w:hint="cs"/>
           <w:rtl/>
         </w:rPr>
       </w:pPr>
@@ -12036,7 +12026,6 @@
     <w:p>
       <w:pPr>
         <w:rPr>
-          <w:rFonts w:hint="cs"/>
           <w:rtl/>
         </w:rPr>
       </w:pPr>
@@ -12093,13 +12082,7 @@
         </w:rPr>
       </w:pPr>
       <w:r>
-        <w:t xml:space="preserve">You are a Playwright Test </w:t>
-      </w:r>
-      <w:r>
-        <w:t>Maintainer</w:t>
-      </w:r>
-      <w:r>
-        <w:t xml:space="preserve"> Agent</w:t>
+        <w:t>You are a Playwright Test Maintainer Agent</w:t>
       </w:r>
       <w:r>
         <w:rPr>
@@ -12536,32 +12519,17 @@
     </w:p>
     <w:p>
       <w:pPr>
-        <w:rPr>
-          <w:rtl/>
-        </w:rPr>
-      </w:pPr>
-    </w:p>
-    <w:p>
-      <w:pPr>
-        <w:rPr>
-          <w:rtl/>
-        </w:rPr>
-      </w:pPr>
-    </w:p>
-    <w:p>
-      <w:pPr>
         <w:pStyle w:val="3"/>
         <w:rPr>
           <w:rtl/>
         </w:rPr>
       </w:pPr>
-      <w:bookmarkStart w:id="21" w:name="_Toc224653124"/>
-      <w:r>
-        <w:rPr>
-          <w:rFonts w:hint="cs"/>
-          <w:rtl/>
-        </w:rPr>
-        <w:lastRenderedPageBreak/>
+      <w:bookmarkStart w:id="21" w:name="_Toc224718595"/>
+      <w:r>
+        <w:rPr>
+          <w:rFonts w:hint="cs"/>
+          <w:rtl/>
+        </w:rPr>
         <w:t>חיבור הסוכנים לתשתית</w:t>
       </w:r>
       <w:bookmarkEnd w:id="21"/>
@@ -12628,6 +12596,7 @@
           <w:rFonts w:hint="cs"/>
           <w:rtl/>
         </w:rPr>
+        <w:lastRenderedPageBreak/>
         <w:t>עם הפקודה הבאה אנו נחבר את סוכני</w:t>
       </w:r>
       <w:r>
@@ -12809,7 +12778,7 @@
           <w:rtl/>
         </w:rPr>
       </w:pPr>
-      <w:bookmarkStart w:id="22" w:name="_Toc224653125"/>
+      <w:bookmarkStart w:id="22" w:name="_Toc224718596"/>
       <w:r>
         <w:rPr>
           <w:rFonts w:hint="cs"/>
@@ -12914,7 +12883,7 @@
         </w:rPr>
       </w:pPr>
       <w:bookmarkStart w:id="23" w:name="_קובץ_ה_-"/>
-      <w:bookmarkStart w:id="24" w:name="_Toc224653126"/>
+      <w:bookmarkStart w:id="24" w:name="_Toc224718597"/>
       <w:bookmarkEnd w:id="23"/>
       <w:r>
         <w:rPr>
@@ -12933,14 +12902,24 @@
     <w:p>
       <w:pPr>
         <w:rPr>
-          <w:rtl/>
-        </w:rPr>
-      </w:pPr>
-      <w:proofErr w:type="spellStart"/>
-      <w:r>
-        <w:t>seed.spec.ts</w:t>
-      </w:r>
-      <w:proofErr w:type="spellEnd"/>
+          <w:rFonts w:hint="cs"/>
+          <w:rtl/>
+        </w:rPr>
+      </w:pPr>
+      <w:r>
+        <w:rPr>
+          <w:rFonts w:hint="cs"/>
+          <w:rtl/>
+        </w:rPr>
+        <w:t xml:space="preserve">קובץ זה </w:t>
+      </w:r>
+      <w:r>
+        <w:rPr>
+          <w:rFonts w:cs="Arial" w:hint="cs"/>
+          <w:rtl/>
+        </w:rPr>
+        <w:t>הוא</w:t>
+      </w:r>
       <w:r>
         <w:rPr>
           <w:rFonts w:cs="Arial"/>
@@ -12953,7 +12932,7 @@
           <w:rFonts w:cs="Arial" w:hint="cs"/>
           <w:rtl/>
         </w:rPr>
-        <w:t>הוא</w:t>
+        <w:t>קובץ</w:t>
       </w:r>
       <w:r>
         <w:rPr>
@@ -12967,173 +12946,250 @@
           <w:rFonts w:cs="Arial" w:hint="cs"/>
           <w:rtl/>
         </w:rPr>
-        <w:t>קובץ</w:t>
+        <w:t>בדיקות</w:t>
+      </w:r>
+      <w:r>
+        <w:rPr>
+          <w:rFonts w:cs="Arial" w:hint="cs"/>
+          <w:rtl/>
+        </w:rPr>
+        <w:t xml:space="preserve">, </w:t>
+      </w:r>
+      <w:r>
+        <w:rPr>
+          <w:rFonts w:cs="Arial" w:hint="cs"/>
+          <w:rtl/>
+        </w:rPr>
+        <w:t xml:space="preserve">שנועד בשביל </w:t>
+      </w:r>
+      <w:r>
+        <w:rPr>
+          <w:rFonts w:cs="Arial" w:hint="cs"/>
+          <w:rtl/>
+        </w:rPr>
+        <w:t xml:space="preserve">הסוכנים של </w:t>
       </w:r>
       <w:r>
         <w:rPr>
           <w:rFonts w:cs="Arial"/>
-          <w:rtl/>
-        </w:rPr>
-        <w:t xml:space="preserve"> </w:t>
+        </w:rPr>
+        <w:t>Playwright</w:t>
       </w:r>
       <w:r>
         <w:rPr>
           <w:rFonts w:cs="Arial" w:hint="cs"/>
           <w:rtl/>
         </w:rPr>
-        <w:t>בדיקות</w:t>
+        <w:t xml:space="preserve"> (על אף שהסיומת </w:t>
       </w:r>
       <w:r>
         <w:rPr>
           <w:rFonts w:cs="Arial"/>
-          <w:rtl/>
-        </w:rPr>
-        <w:t xml:space="preserve"> </w:t>
+        </w:rPr>
+        <w:t>spec</w:t>
       </w:r>
       <w:r>
         <w:rPr>
           <w:rFonts w:cs="Arial" w:hint="cs"/>
           <w:rtl/>
         </w:rPr>
-        <w:t>מיוחד</w:t>
+        <w:t xml:space="preserve"> עלולה לחשוב </w:t>
+      </w:r>
+      <w:r>
+        <w:rPr>
+          <w:rFonts w:cs="Arial" w:hint="cs"/>
+          <w:rtl/>
+        </w:rPr>
+        <w:t>שזה קובץ בדיקות רגיל, הוא נועד רק עבור הסוכנים</w:t>
+      </w:r>
+      <w:r>
+        <w:rPr>
+          <w:rFonts w:cs="Arial" w:hint="cs"/>
+          <w:rtl/>
+        </w:rPr>
+        <w:t>)</w:t>
+      </w:r>
+      <w:r>
+        <w:rPr>
+          <w:rFonts w:hint="cs"/>
+          <w:rtl/>
+        </w:rPr>
+        <w:t>.</w:t>
+      </w:r>
+    </w:p>
+    <w:p>
+      <w:pPr>
+        <w:rPr>
+          <w:rtl/>
+        </w:rPr>
+      </w:pPr>
+      <w:r>
+        <w:rPr>
+          <w:rFonts w:hint="cs"/>
+          <w:rtl/>
+        </w:rPr>
+        <w:t xml:space="preserve">למעשה, אנחנו </w:t>
+      </w:r>
+      <w:r>
+        <w:rPr>
+          <w:rFonts w:hint="cs"/>
+          <w:rtl/>
+        </w:rPr>
+        <w:t xml:space="preserve">מעתיקים אליו </w:t>
+      </w:r>
+      <w:r>
+        <w:rPr>
+          <w:rFonts w:hint="cs"/>
+          <w:rtl/>
+        </w:rPr>
+        <w:t>סט בדיקות</w:t>
+      </w:r>
+      <w:r>
+        <w:rPr>
+          <w:rFonts w:hint="cs"/>
+          <w:rtl/>
+        </w:rPr>
+        <w:t>, שהמטרה שלהם זה להכין את הקרקע לסוכנים, לתת להם נקודת התחלה במערכת, שממנה הם ממשיכים לבצע את הפעולות לכתיבת הבדיקות.</w:t>
+      </w:r>
+    </w:p>
+    <w:p>
+      <w:pPr>
+        <w:rPr>
+          <w:rtl/>
+        </w:rPr>
+      </w:pPr>
+      <w:r>
+        <w:rPr>
+          <w:rFonts w:hint="cs"/>
+          <w:rtl/>
+        </w:rPr>
+        <w:t>ניתן להגיד שזה כמו צעדים מקדימים לבדיקות</w:t>
+      </w:r>
+      <w:r>
+        <w:rPr>
+          <w:rFonts w:hint="cs"/>
+          <w:rtl/>
+        </w:rPr>
+        <w:t xml:space="preserve"> בשביל הסוכנים.</w:t>
+      </w:r>
+    </w:p>
+    <w:p>
+      <w:pPr>
+        <w:rPr>
+          <w:rtl/>
+        </w:rPr>
+      </w:pPr>
+      <w:r>
+        <w:rPr>
+          <w:rFonts w:hint="cs"/>
+          <w:rtl/>
+        </w:rPr>
+        <w:t>למשל:</w:t>
+      </w:r>
+    </w:p>
+    <w:p>
+      <w:pPr>
+        <w:rPr>
+          <w:rFonts w:cs="Arial" w:hint="cs"/>
+          <w:rtl/>
+        </w:rPr>
+      </w:pPr>
+      <w:r>
+        <w:rPr>
+          <w:rFonts w:cs="Arial" w:hint="cs"/>
+          <w:rtl/>
+        </w:rPr>
+        <w:t>נניח שיש לכם במערכת דף התחברות</w:t>
+      </w:r>
+      <w:r>
+        <w:rPr>
+          <w:rFonts w:cs="Arial" w:hint="cs"/>
+          <w:rtl/>
+        </w:rPr>
+        <w:t xml:space="preserve"> (</w:t>
       </w:r>
       <w:r>
         <w:rPr>
           <w:rFonts w:cs="Arial"/>
-          <w:rtl/>
-        </w:rPr>
-        <w:t xml:space="preserve"> </w:t>
+        </w:rPr>
+        <w:t>Login Page</w:t>
       </w:r>
       <w:r>
         <w:rPr>
           <w:rFonts w:cs="Arial" w:hint="cs"/>
           <w:rtl/>
         </w:rPr>
-        <w:t>שמשמש</w:t>
-      </w:r>
-      <w:r>
+        <w:t>)</w:t>
+      </w:r>
+      <w:r>
+        <w:rPr>
+          <w:rFonts w:cs="Arial" w:hint="cs"/>
+          <w:rtl/>
+        </w:rPr>
+        <w:t>, אבל אתם לא רוצים שהסוכן יבדוק את דף ההתחברות, אלא רק את הדף שאחריו</w:t>
+      </w:r>
+      <w:r>
+        <w:rPr>
+          <w:rFonts w:cs="Arial" w:hint="cs"/>
+          <w:rtl/>
+        </w:rPr>
+        <w:t>.</w:t>
+      </w:r>
+    </w:p>
+    <w:p>
+      <w:pPr>
         <w:rPr>
           <w:rFonts w:cs="Arial"/>
           <w:rtl/>
         </w:rPr>
-        <w:t xml:space="preserve"> </w:t>
-      </w:r>
+      </w:pPr>
       <w:r>
         <w:rPr>
           <w:rFonts w:cs="Arial" w:hint="cs"/>
           <w:rtl/>
         </w:rPr>
-        <w:t>כנקודת</w:t>
-      </w:r>
-      <w:r>
-        <w:rPr>
-          <w:rFonts w:cs="Arial"/>
-          <w:rtl/>
-        </w:rPr>
-        <w:t xml:space="preserve"> </w:t>
+        <w:t>לכן, אתם מעתיקים אליו בדיקה שמבצעת התחברות למערכת</w:t>
       </w:r>
       <w:r>
         <w:rPr>
           <w:rFonts w:cs="Arial" w:hint="cs"/>
           <w:rtl/>
         </w:rPr>
-        <w:t>התחלה</w:t>
-      </w:r>
-      <w:r>
-        <w:rPr>
-          <w:rFonts w:cs="Arial"/>
-          <w:rtl/>
-        </w:rPr>
-        <w:t xml:space="preserve"> </w:t>
+        <w:t>. ואז, הוא מדלג על בדיקות של דף</w:t>
       </w:r>
       <w:r>
         <w:rPr>
           <w:rFonts w:cs="Arial" w:hint="cs"/>
           <w:rtl/>
         </w:rPr>
-        <w:t>עבור</w:t>
-      </w:r>
-      <w:r>
-        <w:rPr>
-          <w:rFonts w:cs="Arial"/>
-          <w:rtl/>
-        </w:rPr>
-        <w:t xml:space="preserve"> </w:t>
+        <w:t xml:space="preserve"> ההתחברות, </w:t>
       </w:r>
       <w:r>
         <w:rPr>
           <w:rFonts w:cs="Arial" w:hint="cs"/>
           <w:rtl/>
         </w:rPr>
-        <w:t>סוכני</w:t>
-      </w:r>
-      <w:r>
-        <w:rPr>
-          <w:rFonts w:cs="Arial"/>
-          <w:rtl/>
-        </w:rPr>
-        <w:t xml:space="preserve"> </w:t>
+        <w:t>ו</w:t>
       </w:r>
       <w:r>
         <w:rPr>
           <w:rFonts w:cs="Arial" w:hint="cs"/>
           <w:rtl/>
         </w:rPr>
-        <w:t>ה</w:t>
+        <w:t xml:space="preserve">ממשיך לבדוק את </w:t>
       </w:r>
       <w:r>
         <w:rPr>
           <w:rFonts w:cs="Arial" w:hint="cs"/>
           <w:rtl/>
         </w:rPr>
-        <w:t xml:space="preserve"> </w:t>
-      </w:r>
-      <w:r>
-        <w:rPr>
-          <w:rFonts w:cs="Arial"/>
-          <w:rtl/>
-        </w:rPr>
-        <w:t>-</w:t>
+        <w:t>הדפים שאחריו</w:t>
       </w:r>
       <w:r>
         <w:rPr>
           <w:rFonts w:cs="Arial" w:hint="cs"/>
           <w:rtl/>
         </w:rPr>
-        <w:t xml:space="preserve"> </w:t>
-      </w:r>
-      <w:r>
-        <w:t>AI</w:t>
-      </w:r>
-      <w:r>
-        <w:rPr>
-          <w:rFonts w:cs="Arial"/>
-          <w:rtl/>
-        </w:rPr>
-        <w:t xml:space="preserve"> </w:t>
-      </w:r>
-      <w:r>
-        <w:rPr>
-          <w:rFonts w:cs="Arial" w:hint="cs"/>
-          <w:rtl/>
-        </w:rPr>
-        <w:t>של</w:t>
-      </w:r>
-      <w:r>
-        <w:rPr>
-          <w:rFonts w:cs="Arial"/>
-          <w:rtl/>
-        </w:rPr>
-        <w:t xml:space="preserve"> </w:t>
-      </w:r>
-      <w:r>
-        <w:t>Playwright</w:t>
-      </w:r>
-      <w:r>
-        <w:rPr>
-          <w:rFonts w:cs="Arial"/>
-          <w:rtl/>
-        </w:rPr>
         <w:t>.</w:t>
       </w:r>
     </w:p>
@@ -13143,2130 +13199,52 @@
           <w:rtl/>
         </w:rPr>
       </w:pPr>
-      <w:r>
-        <w:rPr>
-          <w:rFonts w:cs="Arial" w:hint="cs"/>
-          <w:rtl/>
-        </w:rPr>
-        <w:t>במקום</w:t>
-      </w:r>
-      <w:r>
-        <w:rPr>
-          <w:rFonts w:cs="Arial"/>
-          <w:rtl/>
-        </w:rPr>
-        <w:t xml:space="preserve"> </w:t>
-      </w:r>
-      <w:r>
-        <w:rPr>
-          <w:rFonts w:cs="Arial" w:hint="cs"/>
-          <w:rtl/>
-        </w:rPr>
-        <w:t>לשמש כ -</w:t>
-      </w:r>
-      <w:r>
-        <w:rPr>
-          <w:rFonts w:cs="Arial"/>
-          <w:rtl/>
-        </w:rPr>
-        <w:t xml:space="preserve"> “</w:t>
-      </w:r>
-      <w:r>
-        <w:rPr>
-          <w:rFonts w:cs="Arial" w:hint="cs"/>
-          <w:rtl/>
-        </w:rPr>
-        <w:t>בדיקה</w:t>
-      </w:r>
-      <w:r>
-        <w:rPr>
-          <w:rFonts w:cs="Arial"/>
-          <w:rtl/>
-        </w:rPr>
-        <w:t xml:space="preserve"> </w:t>
-      </w:r>
-      <w:r>
-        <w:rPr>
-          <w:rFonts w:cs="Arial" w:hint="cs"/>
-          <w:rtl/>
-        </w:rPr>
-        <w:t>רגילה</w:t>
-      </w:r>
-      <w:r>
-        <w:rPr>
-          <w:rFonts w:cs="Arial" w:hint="eastAsia"/>
-          <w:rtl/>
-        </w:rPr>
-        <w:t>”</w:t>
-      </w:r>
-      <w:r>
-        <w:rPr>
-          <w:rFonts w:cs="Arial" w:hint="cs"/>
-          <w:rtl/>
-        </w:rPr>
-        <w:t xml:space="preserve"> (כי יש לו את הסיומת </w:t>
-      </w:r>
-      <w:r>
-        <w:rPr>
-          <w:rFonts w:cs="Arial"/>
-        </w:rPr>
-        <w:t>spec</w:t>
-      </w:r>
-      <w:r>
-        <w:rPr>
-          <w:rFonts w:cs="Arial" w:hint="cs"/>
-          <w:rtl/>
-        </w:rPr>
-        <w:t xml:space="preserve"> מה שעלול ליצור בלבול)</w:t>
-      </w:r>
-      <w:r>
-        <w:rPr>
-          <w:rFonts w:cs="Arial"/>
-          <w:rtl/>
-        </w:rPr>
-        <w:t>,</w:t>
-      </w:r>
-      <w:r>
-        <w:rPr>
-          <w:rFonts w:cs="Arial"/>
-          <w:rtl/>
-        </w:rPr>
-        <w:br/>
-      </w:r>
-      <w:r>
-        <w:rPr>
-          <w:rFonts w:cs="Arial" w:hint="cs"/>
-          <w:rtl/>
-        </w:rPr>
-        <w:t>הוא</w:t>
-      </w:r>
-      <w:r>
-        <w:rPr>
-          <w:rFonts w:cs="Arial"/>
-          <w:rtl/>
-        </w:rPr>
-        <w:t xml:space="preserve"> </w:t>
-      </w:r>
-      <w:r>
-        <w:rPr>
-          <w:rFonts w:cs="Arial" w:hint="cs"/>
-          <w:rtl/>
-        </w:rPr>
-        <w:t>משמש</w:t>
-      </w:r>
-      <w:r>
-        <w:rPr>
-          <w:rFonts w:cs="Arial"/>
-          <w:rtl/>
-        </w:rPr>
-        <w:t xml:space="preserve"> </w:t>
-      </w:r>
-      <w:r>
-        <w:rPr>
-          <w:rFonts w:cs="Arial" w:hint="cs"/>
-          <w:rtl/>
-        </w:rPr>
-        <w:t>כדוגמה</w:t>
-      </w:r>
-      <w:r>
-        <w:rPr>
-          <w:rFonts w:cs="Arial"/>
-          <w:rtl/>
-        </w:rPr>
-        <w:t xml:space="preserve"> </w:t>
-      </w:r>
-      <w:r>
-        <w:rPr>
-          <w:rFonts w:cs="Arial" w:hint="cs"/>
-          <w:rtl/>
-        </w:rPr>
-        <w:t>חיה</w:t>
-      </w:r>
-      <w:r>
-        <w:rPr>
-          <w:rFonts w:cs="Arial"/>
-          <w:rtl/>
-        </w:rPr>
-        <w:t>/</w:t>
-      </w:r>
-      <w:r>
-        <w:rPr>
-          <w:rFonts w:cs="Arial" w:hint="cs"/>
-          <w:rtl/>
-        </w:rPr>
-        <w:t>קונטקסט</w:t>
-      </w:r>
-      <w:r>
-        <w:rPr>
-          <w:rFonts w:cs="Arial" w:hint="cs"/>
-          <w:rtl/>
-        </w:rPr>
-        <w:t>,</w:t>
-      </w:r>
-      <w:r>
-        <w:rPr>
-          <w:rFonts w:cs="Arial"/>
-          <w:rtl/>
-        </w:rPr>
-        <w:t xml:space="preserve"> </w:t>
-      </w:r>
-      <w:r>
-        <w:rPr>
-          <w:rFonts w:cs="Arial" w:hint="cs"/>
-          <w:rtl/>
-        </w:rPr>
-        <w:t>שממנה</w:t>
-      </w:r>
-      <w:r>
-        <w:rPr>
-          <w:rFonts w:cs="Arial"/>
-          <w:rtl/>
-        </w:rPr>
-        <w:t xml:space="preserve"> </w:t>
-      </w:r>
-      <w:r>
-        <w:rPr>
-          <w:rFonts w:cs="Arial" w:hint="cs"/>
-          <w:rtl/>
-        </w:rPr>
-        <w:t>הסוכנים</w:t>
-      </w:r>
-      <w:r>
-        <w:rPr>
-          <w:rFonts w:cs="Arial"/>
-          <w:rtl/>
-        </w:rPr>
-        <w:t xml:space="preserve"> </w:t>
-      </w:r>
-      <w:r>
-        <w:rPr>
-          <w:rFonts w:cs="Arial" w:hint="cs"/>
-          <w:rtl/>
-        </w:rPr>
-        <w:t>לומדים</w:t>
-      </w:r>
-      <w:r>
-        <w:rPr>
-          <w:rFonts w:cs="Arial"/>
-          <w:rtl/>
-        </w:rPr>
-        <w:t>:</w:t>
-      </w:r>
-    </w:p>
-    <w:p>
-      <w:pPr>
-        <w:pStyle w:val="a9"/>
-        <w:numPr>
-          <w:ilvl w:val="0"/>
-          <w:numId w:val="6"/>
-        </w:numPr>
-        <w:rPr>
-          <w:rtl/>
-        </w:rPr>
-      </w:pPr>
-      <w:r>
-        <w:rPr>
-          <w:rFonts w:cs="Arial" w:hint="cs"/>
-          <w:rtl/>
-        </w:rPr>
-        <w:t>איך</w:t>
-      </w:r>
-      <w:r>
-        <w:rPr>
-          <w:rFonts w:cs="Arial"/>
-          <w:rtl/>
-        </w:rPr>
-        <w:t xml:space="preserve"> </w:t>
-      </w:r>
-      <w:r>
-        <w:rPr>
-          <w:rFonts w:cs="Arial" w:hint="cs"/>
-          <w:rtl/>
-        </w:rPr>
-        <w:t>האפליקציה</w:t>
-      </w:r>
-      <w:r>
-        <w:rPr>
-          <w:rFonts w:cs="Arial"/>
-          <w:rtl/>
-        </w:rPr>
-        <w:t xml:space="preserve"> </w:t>
-      </w:r>
-      <w:r>
-        <w:rPr>
-          <w:rFonts w:cs="Arial" w:hint="cs"/>
-          <w:rtl/>
-        </w:rPr>
-        <w:t>עובדת</w:t>
-      </w:r>
-    </w:p>
-    <w:p>
-      <w:pPr>
-        <w:pStyle w:val="a9"/>
-        <w:numPr>
-          <w:ilvl w:val="0"/>
-          <w:numId w:val="6"/>
-        </w:numPr>
-      </w:pPr>
-      <w:r>
-        <w:rPr>
-          <w:rFonts w:cs="Arial" w:hint="cs"/>
-          <w:rtl/>
-        </w:rPr>
-        <w:t>איך</w:t>
-      </w:r>
-      <w:r>
-        <w:rPr>
-          <w:rFonts w:cs="Arial"/>
-          <w:rtl/>
-        </w:rPr>
-        <w:t xml:space="preserve"> </w:t>
-      </w:r>
-      <w:r>
-        <w:rPr>
-          <w:rFonts w:cs="Arial" w:hint="cs"/>
-          <w:rtl/>
-        </w:rPr>
-        <w:t>ניגשים</w:t>
-      </w:r>
-      <w:r>
-        <w:rPr>
-          <w:rFonts w:cs="Arial"/>
-          <w:rtl/>
-        </w:rPr>
-        <w:t xml:space="preserve"> </w:t>
-      </w:r>
-      <w:r>
-        <w:rPr>
-          <w:rFonts w:cs="Arial" w:hint="cs"/>
-          <w:rtl/>
-        </w:rPr>
-        <w:t>אליה</w:t>
-      </w:r>
-    </w:p>
-    <w:p>
-      <w:pPr>
-        <w:pStyle w:val="a9"/>
-        <w:numPr>
-          <w:ilvl w:val="0"/>
-          <w:numId w:val="6"/>
-        </w:numPr>
-      </w:pPr>
-      <w:r>
-        <w:rPr>
-          <w:rFonts w:cs="Arial" w:hint="cs"/>
-          <w:rtl/>
-        </w:rPr>
-        <w:t>איך</w:t>
-      </w:r>
-      <w:r>
-        <w:rPr>
-          <w:rFonts w:cs="Arial"/>
-          <w:rtl/>
-        </w:rPr>
-        <w:t xml:space="preserve"> </w:t>
-      </w:r>
-      <w:r>
-        <w:rPr>
-          <w:rFonts w:cs="Arial" w:hint="cs"/>
-          <w:rtl/>
-        </w:rPr>
-        <w:t>נראה</w:t>
-      </w:r>
-      <w:r>
-        <w:rPr>
-          <w:rFonts w:cs="Arial"/>
-          <w:rtl/>
-        </w:rPr>
-        <w:t xml:space="preserve"> </w:t>
-      </w:r>
-      <w:r>
-        <w:rPr>
-          <w:rFonts w:hint="cs"/>
-          <w:rtl/>
-        </w:rPr>
-        <w:t>תהליך זרימת מערכת</w:t>
-      </w:r>
-      <w:r>
-        <w:rPr>
-          <w:rFonts w:cs="Arial"/>
-          <w:rtl/>
-        </w:rPr>
-        <w:t xml:space="preserve"> </w:t>
-      </w:r>
-      <w:r>
-        <w:rPr>
-          <w:rFonts w:cs="Arial" w:hint="cs"/>
-          <w:rtl/>
-        </w:rPr>
-        <w:t>תקין</w:t>
-      </w:r>
-    </w:p>
-    <w:p>
-      <w:pPr>
-        <w:pStyle w:val="a9"/>
-        <w:numPr>
-          <w:ilvl w:val="0"/>
-          <w:numId w:val="6"/>
-        </w:numPr>
-        <w:rPr>
-          <w:rtl/>
-        </w:rPr>
-      </w:pPr>
-      <w:r>
-        <w:rPr>
-          <w:rFonts w:cs="Arial" w:hint="cs"/>
-          <w:rtl/>
-        </w:rPr>
-        <w:t>אילו</w:t>
-      </w:r>
-      <w:r>
-        <w:rPr>
-          <w:rFonts w:cs="Arial"/>
-          <w:rtl/>
-        </w:rPr>
-        <w:t xml:space="preserve"> </w:t>
-      </w:r>
-      <w:r>
-        <w:t>patterns</w:t>
-      </w:r>
-      <w:r>
-        <w:rPr>
-          <w:rFonts w:cs="Arial"/>
-          <w:rtl/>
-        </w:rPr>
-        <w:t xml:space="preserve"> </w:t>
-      </w:r>
-      <w:r>
-        <w:rPr>
-          <w:rFonts w:cs="Arial" w:hint="cs"/>
-          <w:rtl/>
-        </w:rPr>
-        <w:t>א</w:t>
-      </w:r>
-      <w:r>
-        <w:rPr>
-          <w:rFonts w:cs="Arial" w:hint="cs"/>
-          <w:rtl/>
-        </w:rPr>
-        <w:t>נו נרצה</w:t>
-      </w:r>
-      <w:r>
-        <w:rPr>
-          <w:rFonts w:cs="Arial"/>
-          <w:rtl/>
-        </w:rPr>
-        <w:t xml:space="preserve"> </w:t>
-      </w:r>
-      <w:r>
-        <w:rPr>
-          <w:rFonts w:cs="Arial" w:hint="cs"/>
-          <w:rtl/>
-        </w:rPr>
-        <w:t>שייווצרו</w:t>
-      </w:r>
-      <w:r>
-        <w:rPr>
-          <w:rFonts w:cs="Arial"/>
-          <w:rtl/>
-        </w:rPr>
-        <w:t xml:space="preserve"> </w:t>
-      </w:r>
-      <w:r>
-        <w:rPr>
-          <w:rFonts w:cs="Arial" w:hint="cs"/>
-          <w:rtl/>
-        </w:rPr>
-        <w:t>בבדיקות</w:t>
-      </w:r>
-    </w:p>
-    <w:p>
-      <w:pPr>
-        <w:pStyle w:val="4"/>
-        <w:rPr>
-          <w:rFonts w:hint="cs"/>
-          <w:rtl/>
-        </w:rPr>
-      </w:pPr>
-      <w:r>
-        <w:rPr>
-          <w:rFonts w:hint="cs"/>
-          <w:rtl/>
-        </w:rPr>
-        <w:t>למה</w:t>
-      </w:r>
-      <w:r>
-        <w:rPr>
-          <w:rtl/>
-        </w:rPr>
-        <w:t xml:space="preserve"> </w:t>
-      </w:r>
-      <w:r>
-        <w:rPr>
-          <w:rFonts w:hint="cs"/>
-          <w:rtl/>
-        </w:rPr>
-        <w:t>בכלל</w:t>
-      </w:r>
-      <w:r>
-        <w:rPr>
-          <w:rtl/>
-        </w:rPr>
-        <w:t xml:space="preserve"> </w:t>
-      </w:r>
-      <w:r>
-        <w:rPr>
-          <w:rFonts w:hint="cs"/>
-          <w:rtl/>
-        </w:rPr>
-        <w:t>צריך</w:t>
-      </w:r>
-      <w:r>
-        <w:rPr>
-          <w:rtl/>
-        </w:rPr>
-        <w:t xml:space="preserve"> </w:t>
-      </w:r>
-      <w:r>
-        <w:t>seed</w:t>
-      </w:r>
-    </w:p>
-    <w:p>
-      <w:pPr>
-        <w:rPr>
-          <w:rtl/>
-        </w:rPr>
-      </w:pPr>
-      <w:r>
-        <w:rPr>
-          <w:rFonts w:cs="Arial" w:hint="cs"/>
-          <w:rtl/>
-        </w:rPr>
-        <w:t>כאשר מתעסקים עם סוכני</w:t>
-      </w:r>
-      <w:r>
-        <w:t xml:space="preserve">Playwright </w:t>
-      </w:r>
-      <w:r>
-        <w:rPr>
-          <w:rFonts w:cs="Arial" w:hint="cs"/>
-          <w:rtl/>
-        </w:rPr>
-        <w:t xml:space="preserve">, </w:t>
-      </w:r>
-      <w:r>
-        <w:rPr>
-          <w:rFonts w:cs="Arial" w:hint="cs"/>
-          <w:rtl/>
-        </w:rPr>
-        <w:t>יש</w:t>
-      </w:r>
-      <w:r>
-        <w:rPr>
-          <w:rFonts w:cs="Arial"/>
-          <w:rtl/>
-        </w:rPr>
-        <w:t xml:space="preserve"> </w:t>
-      </w:r>
-      <w:r>
-        <w:rPr>
-          <w:rFonts w:cs="Arial" w:hint="cs"/>
-          <w:highlight w:val="red"/>
-          <w:rtl/>
-        </w:rPr>
-        <w:t>בעיה</w:t>
-      </w:r>
-      <w:r>
-        <w:rPr>
-          <w:rFonts w:cs="Arial"/>
-          <w:rtl/>
-        </w:rPr>
-        <w:t xml:space="preserve"> </w:t>
-      </w:r>
-      <w:r>
-        <w:rPr>
-          <w:rFonts w:cs="Arial" w:hint="cs"/>
-          <w:rtl/>
-        </w:rPr>
-        <w:t>בסיסית</w:t>
-      </w:r>
-      <w:r>
-        <w:rPr>
-          <w:rFonts w:cs="Arial"/>
-          <w:rtl/>
-        </w:rPr>
-        <w:t>:</w:t>
-      </w:r>
-      <w:r>
-        <w:rPr>
-          <w:rFonts w:hint="cs"/>
-          <w:rtl/>
-        </w:rPr>
-        <w:t xml:space="preserve"> </w:t>
-      </w:r>
-      <w:r>
-        <w:rPr>
-          <w:rFonts w:cs="Arial" w:hint="cs"/>
-          <w:rtl/>
-        </w:rPr>
-        <w:t>ה</w:t>
-      </w:r>
-      <w:r>
-        <w:rPr>
-          <w:rFonts w:cs="Arial" w:hint="cs"/>
-          <w:rtl/>
-        </w:rPr>
-        <w:t xml:space="preserve"> </w:t>
-      </w:r>
-      <w:r>
-        <w:rPr>
-          <w:rFonts w:cs="Arial"/>
-          <w:rtl/>
-        </w:rPr>
-        <w:t>-</w:t>
-      </w:r>
-      <w:r>
-        <w:rPr>
-          <w:rFonts w:cs="Arial" w:hint="cs"/>
-          <w:rtl/>
-        </w:rPr>
-        <w:t xml:space="preserve"> </w:t>
-      </w:r>
-      <w:r>
-        <w:t>AI</w:t>
-      </w:r>
-      <w:r>
-        <w:rPr>
-          <w:rFonts w:cs="Arial"/>
-          <w:rtl/>
-        </w:rPr>
-        <w:t xml:space="preserve"> </w:t>
-      </w:r>
-      <w:r>
-        <w:rPr>
-          <w:rFonts w:cs="Arial" w:hint="cs"/>
-          <w:rtl/>
-        </w:rPr>
-        <w:t>לא</w:t>
-      </w:r>
-      <w:r>
-        <w:rPr>
-          <w:rFonts w:cs="Arial"/>
-          <w:rtl/>
-        </w:rPr>
-        <w:t xml:space="preserve"> </w:t>
-      </w:r>
-      <w:r>
-        <w:rPr>
-          <w:rFonts w:cs="Arial" w:hint="cs"/>
-          <w:rtl/>
-        </w:rPr>
-        <w:t>מכיר</w:t>
-      </w:r>
-      <w:r>
-        <w:rPr>
-          <w:rFonts w:cs="Arial"/>
-          <w:rtl/>
-        </w:rPr>
-        <w:t xml:space="preserve"> </w:t>
-      </w:r>
-      <w:r>
-        <w:rPr>
-          <w:rFonts w:cs="Arial" w:hint="cs"/>
-          <w:rtl/>
-        </w:rPr>
-        <w:t>את</w:t>
-      </w:r>
-      <w:r>
-        <w:rPr>
-          <w:rFonts w:cs="Arial"/>
-          <w:rtl/>
-        </w:rPr>
-        <w:t xml:space="preserve"> </w:t>
-      </w:r>
-      <w:r>
-        <w:rPr>
-          <w:rFonts w:cs="Arial" w:hint="cs"/>
-          <w:rtl/>
-        </w:rPr>
-        <w:t>המערכת</w:t>
-      </w:r>
-      <w:r>
-        <w:rPr>
-          <w:rFonts w:cs="Arial"/>
-          <w:rtl/>
-        </w:rPr>
-        <w:t xml:space="preserve"> </w:t>
-      </w:r>
-      <w:r>
-        <w:rPr>
-          <w:rFonts w:cs="Arial" w:hint="cs"/>
-          <w:rtl/>
-        </w:rPr>
-        <w:t>שלך</w:t>
-      </w:r>
-      <w:r>
-        <w:rPr>
-          <w:rFonts w:cs="Arial"/>
-          <w:rtl/>
-        </w:rPr>
-        <w:t>.</w:t>
-      </w:r>
-    </w:p>
-    <w:p>
-      <w:pPr>
-        <w:rPr>
-          <w:rtl/>
-        </w:rPr>
-      </w:pPr>
-      <w:r>
-        <w:rPr>
-          <w:rFonts w:hint="cs"/>
-          <w:rtl/>
-        </w:rPr>
-        <w:t xml:space="preserve">המערכת שלך היא לא מרכז העולם... </w:t>
-      </w:r>
-      <w:r>
-        <w:rPr>
-          <w:rFonts w:ascii="Segoe UI Emoji" w:hAnsi="Segoe UI Emoji" w:cs="Times New Roman" w:hint="cs"/>
-          <w:rtl/>
-        </w:rPr>
-        <w:t>🫣</w:t>
-      </w:r>
-    </w:p>
-    <w:p>
-      <w:pPr>
-        <w:rPr>
-          <w:rFonts w:cs="Arial"/>
-          <w:rtl/>
-        </w:rPr>
-      </w:pPr>
-      <w:r>
-        <w:rPr>
-          <w:rFonts w:cs="Arial" w:hint="cs"/>
-          <w:rtl/>
-        </w:rPr>
-        <w:t>אז</w:t>
-      </w:r>
-      <w:r>
-        <w:rPr>
-          <w:rFonts w:cs="Arial"/>
-          <w:rtl/>
-        </w:rPr>
-        <w:t xml:space="preserve"> </w:t>
-      </w:r>
-      <w:r>
-        <w:rPr>
-          <w:rFonts w:cs="Arial" w:hint="cs"/>
-          <w:rtl/>
-        </w:rPr>
-        <w:t>במקום</w:t>
-      </w:r>
-      <w:r>
-        <w:rPr>
-          <w:rFonts w:cs="Arial"/>
-          <w:rtl/>
-        </w:rPr>
-        <w:t xml:space="preserve"> </w:t>
-      </w:r>
-      <w:r>
-        <w:rPr>
-          <w:rFonts w:cs="Arial" w:hint="cs"/>
-          <w:rtl/>
-        </w:rPr>
-        <w:t>לתת</w:t>
-      </w:r>
-      <w:r>
-        <w:rPr>
-          <w:rFonts w:cs="Arial"/>
-          <w:rtl/>
-        </w:rPr>
-        <w:t xml:space="preserve"> </w:t>
-      </w:r>
-      <w:r>
-        <w:rPr>
-          <w:rFonts w:cs="Arial" w:hint="cs"/>
-          <w:rtl/>
-        </w:rPr>
-        <w:t>לו</w:t>
-      </w:r>
-      <w:r>
-        <w:rPr>
-          <w:rFonts w:cs="Arial"/>
-          <w:rtl/>
-        </w:rPr>
-        <w:t xml:space="preserve"> </w:t>
-      </w:r>
-      <w:r>
-        <w:rPr>
-          <w:rFonts w:cs="Arial" w:hint="cs"/>
-          <w:rtl/>
-        </w:rPr>
-        <w:t>לנחש</w:t>
-      </w:r>
-      <w:r>
-        <w:rPr>
-          <w:rFonts w:cs="Arial"/>
-          <w:rtl/>
-        </w:rPr>
-        <w:t xml:space="preserve">, </w:t>
-      </w:r>
-      <w:r>
-        <w:rPr>
-          <w:rFonts w:cs="Arial" w:hint="cs"/>
-          <w:rtl/>
-        </w:rPr>
-        <w:t>נותנים</w:t>
-      </w:r>
-      <w:r>
-        <w:rPr>
-          <w:rFonts w:cs="Arial"/>
-          <w:rtl/>
-        </w:rPr>
-        <w:t xml:space="preserve"> </w:t>
-      </w:r>
-      <w:r>
-        <w:rPr>
-          <w:rFonts w:cs="Arial" w:hint="cs"/>
-          <w:rtl/>
-        </w:rPr>
-        <w:t>לו</w:t>
-      </w:r>
-      <w:r>
-        <w:rPr>
-          <w:rFonts w:cs="Arial"/>
-          <w:rtl/>
-        </w:rPr>
-        <w:t xml:space="preserve"> “</w:t>
-      </w:r>
-      <w:r>
-        <w:t>seed</w:t>
-      </w:r>
-      <w:r>
-        <w:rPr>
-          <w:rFonts w:cs="Arial"/>
-          <w:rtl/>
-        </w:rPr>
-        <w:t>”</w:t>
-      </w:r>
-      <w:r>
-        <w:rPr>
-          <w:rFonts w:cs="Arial" w:hint="cs"/>
-          <w:rtl/>
-        </w:rPr>
-        <w:t>,</w:t>
-      </w:r>
-    </w:p>
-    <w:p>
-      <w:pPr>
-        <w:rPr>
-          <w:rtl/>
-        </w:rPr>
-      </w:pPr>
-      <w:r>
-        <w:rPr>
-          <w:rFonts w:cs="Arial" w:hint="cs"/>
-          <w:rtl/>
-        </w:rPr>
-        <w:t>שזה אומר</w:t>
-      </w:r>
-      <w:r>
-        <w:rPr>
-          <w:rFonts w:cs="Arial"/>
-          <w:rtl/>
-        </w:rPr>
-        <w:t>:</w:t>
-      </w:r>
-      <w:r>
-        <w:rPr>
-          <w:rFonts w:hint="cs"/>
-          <w:rtl/>
-        </w:rPr>
-        <w:t xml:space="preserve"> </w:t>
-      </w:r>
-      <w:r>
-        <w:rPr>
-          <w:rFonts w:cs="Arial" w:hint="eastAsia"/>
-          <w:rtl/>
-        </w:rPr>
-        <w:t>“</w:t>
-      </w:r>
-      <w:r>
-        <w:rPr>
-          <w:rFonts w:cs="Arial" w:hint="cs"/>
-          <w:rtl/>
-        </w:rPr>
-        <w:t>הנה</w:t>
-      </w:r>
-      <w:r>
-        <w:rPr>
-          <w:rFonts w:cs="Arial"/>
-          <w:rtl/>
-        </w:rPr>
-        <w:t xml:space="preserve"> </w:t>
-      </w:r>
-      <w:r>
-        <w:rPr>
-          <w:rFonts w:cs="Arial" w:hint="cs"/>
-          <w:rtl/>
-        </w:rPr>
-        <w:t xml:space="preserve">כמה בדיקות </w:t>
-      </w:r>
-      <w:r>
-        <w:rPr>
-          <w:rFonts w:cs="Arial" w:hint="cs"/>
-          <w:rtl/>
-        </w:rPr>
-        <w:t>טוב</w:t>
-      </w:r>
-      <w:r>
-        <w:rPr>
-          <w:rFonts w:cs="Arial" w:hint="cs"/>
-          <w:rtl/>
-        </w:rPr>
-        <w:t>ות</w:t>
-      </w:r>
-      <w:r>
-        <w:rPr>
-          <w:rFonts w:cs="Arial"/>
-          <w:rtl/>
-        </w:rPr>
-        <w:t xml:space="preserve">, </w:t>
-      </w:r>
-      <w:r>
-        <w:rPr>
-          <w:rFonts w:cs="Arial" w:hint="cs"/>
-          <w:rtl/>
-        </w:rPr>
-        <w:t>תלמד</w:t>
-      </w:r>
-      <w:r>
-        <w:rPr>
-          <w:rFonts w:cs="Arial"/>
-          <w:rtl/>
-        </w:rPr>
-        <w:t xml:space="preserve"> </w:t>
-      </w:r>
-      <w:r>
-        <w:rPr>
-          <w:rFonts w:cs="Arial" w:hint="cs"/>
-          <w:rtl/>
-        </w:rPr>
-        <w:t xml:space="preserve">מהם </w:t>
-      </w:r>
-      <w:r>
-        <w:rPr>
-          <w:rFonts w:cs="Arial" w:hint="cs"/>
-          <w:rtl/>
-        </w:rPr>
-        <w:t>ותבנה</w:t>
-      </w:r>
-      <w:r>
-        <w:rPr>
-          <w:rFonts w:cs="Arial"/>
-          <w:rtl/>
-        </w:rPr>
-        <w:t xml:space="preserve"> </w:t>
-      </w:r>
-      <w:r>
-        <w:rPr>
-          <w:rFonts w:cs="Arial" w:hint="cs"/>
-          <w:rtl/>
-        </w:rPr>
-        <w:t>עוד</w:t>
-      </w:r>
-      <w:r>
-        <w:rPr>
-          <w:rFonts w:cs="Arial" w:hint="eastAsia"/>
-          <w:rtl/>
-        </w:rPr>
-        <w:t>”</w:t>
-      </w:r>
-    </w:p>
-    <w:p>
-      <w:pPr>
-        <w:rPr>
-          <w:rFonts w:hint="cs"/>
-          <w:rtl/>
-        </w:rPr>
-      </w:pPr>
-      <w:r>
-        <w:rPr>
-          <w:rFonts w:cs="Arial" w:hint="cs"/>
-          <w:rtl/>
-        </w:rPr>
-        <w:t>זה</w:t>
-      </w:r>
-      <w:r>
-        <w:rPr>
-          <w:rFonts w:cs="Arial"/>
-          <w:rtl/>
-        </w:rPr>
-        <w:t xml:space="preserve"> </w:t>
-      </w:r>
-      <w:r>
-        <w:rPr>
-          <w:rFonts w:cs="Arial" w:hint="cs"/>
-          <w:rtl/>
-        </w:rPr>
-        <w:t>עוזר</w:t>
-      </w:r>
-      <w:r>
-        <w:rPr>
-          <w:rFonts w:cs="Arial"/>
-          <w:rtl/>
-        </w:rPr>
-        <w:t xml:space="preserve"> </w:t>
-      </w:r>
-      <w:r>
-        <w:rPr>
-          <w:rFonts w:cs="Arial" w:hint="cs"/>
-          <w:rtl/>
-        </w:rPr>
-        <w:t>לו</w:t>
-      </w:r>
-      <w:r>
-        <w:rPr>
-          <w:rFonts w:cs="Arial"/>
-          <w:rtl/>
-        </w:rPr>
-        <w:t xml:space="preserve"> </w:t>
-      </w:r>
-      <w:r>
-        <w:rPr>
-          <w:rFonts w:cs="Arial" w:hint="cs"/>
-          <w:rtl/>
-        </w:rPr>
-        <w:t>להבין</w:t>
-      </w:r>
-      <w:r>
-        <w:rPr>
-          <w:rFonts w:cs="Arial"/>
-          <w:rtl/>
-        </w:rPr>
-        <w:t>:</w:t>
-      </w:r>
-    </w:p>
-    <w:p>
-      <w:pPr>
-        <w:pStyle w:val="a9"/>
-        <w:numPr>
-          <w:ilvl w:val="0"/>
-          <w:numId w:val="6"/>
-        </w:numPr>
-      </w:pPr>
-      <w:r>
-        <w:rPr>
-          <w:rFonts w:hint="cs"/>
-          <w:rtl/>
-        </w:rPr>
-        <w:lastRenderedPageBreak/>
-        <w:t>את ה</w:t>
-      </w:r>
-      <w:r>
-        <w:rPr>
-          <w:rFonts w:hint="cs"/>
-          <w:rtl/>
-        </w:rPr>
-        <w:t>זיהויים</w:t>
-      </w:r>
-      <w:r>
-        <w:rPr>
-          <w:rFonts w:cs="Arial"/>
-          <w:rtl/>
-        </w:rPr>
-        <w:t xml:space="preserve"> </w:t>
-      </w:r>
-      <w:r>
-        <w:rPr>
-          <w:rFonts w:cs="Arial" w:hint="cs"/>
-          <w:rtl/>
-        </w:rPr>
-        <w:t>שיש במערכת</w:t>
-      </w:r>
-      <w:r>
-        <w:rPr>
-          <w:rFonts w:hint="cs"/>
-          <w:rtl/>
-        </w:rPr>
-        <w:t xml:space="preserve"> (</w:t>
-      </w:r>
-      <w:r>
-        <w:rPr>
-          <w:rFonts w:cs="Arial" w:hint="cs"/>
-          <w:rtl/>
-        </w:rPr>
-        <w:t>אם</w:t>
-      </w:r>
-      <w:r>
-        <w:rPr>
-          <w:rFonts w:cs="Arial"/>
-          <w:rtl/>
-        </w:rPr>
-        <w:t xml:space="preserve"> </w:t>
-      </w:r>
-      <w:r>
-        <w:rPr>
-          <w:rFonts w:cs="Arial" w:hint="cs"/>
-          <w:rtl/>
-        </w:rPr>
-        <w:t>השתמשת</w:t>
-      </w:r>
-      <w:r>
-        <w:rPr>
-          <w:rFonts w:cs="Arial"/>
-          <w:rtl/>
-        </w:rPr>
-        <w:t xml:space="preserve"> </w:t>
-      </w:r>
-      <w:r>
-        <w:rPr>
-          <w:rFonts w:cs="Arial" w:hint="cs"/>
-          <w:rtl/>
-        </w:rPr>
-        <w:t>ב</w:t>
-      </w:r>
-      <w:r>
-        <w:rPr>
-          <w:rFonts w:cs="Arial" w:hint="cs"/>
-          <w:rtl/>
-        </w:rPr>
-        <w:t xml:space="preserve"> - </w:t>
-      </w:r>
-      <w:r>
-        <w:t>data-</w:t>
-      </w:r>
-      <w:proofErr w:type="spellStart"/>
-      <w:r>
-        <w:t>testid</w:t>
-      </w:r>
-      <w:proofErr w:type="spellEnd"/>
-      <w:r>
-        <w:rPr>
-          <w:rFonts w:cs="Arial"/>
-          <w:rtl/>
-        </w:rPr>
-        <w:t xml:space="preserve">, </w:t>
-      </w:r>
-      <w:r>
-        <w:rPr>
-          <w:rFonts w:cs="Arial" w:hint="cs"/>
-          <w:rtl/>
-        </w:rPr>
-        <w:t>הם</w:t>
-      </w:r>
-      <w:r>
-        <w:rPr>
-          <w:rFonts w:cs="Arial"/>
-          <w:rtl/>
-        </w:rPr>
-        <w:t xml:space="preserve"> </w:t>
-      </w:r>
-      <w:r>
-        <w:rPr>
-          <w:rFonts w:cs="Arial" w:hint="cs"/>
-          <w:rtl/>
-        </w:rPr>
-        <w:t>ימשיכו</w:t>
-      </w:r>
-      <w:r>
-        <w:rPr>
-          <w:rFonts w:cs="Arial"/>
-          <w:rtl/>
-        </w:rPr>
-        <w:t xml:space="preserve"> </w:t>
-      </w:r>
-      <w:r>
-        <w:rPr>
-          <w:rFonts w:cs="Arial" w:hint="cs"/>
-          <w:rtl/>
-        </w:rPr>
-        <w:t>להשתמש</w:t>
-      </w:r>
-      <w:r>
-        <w:rPr>
-          <w:rFonts w:cs="Arial"/>
-          <w:rtl/>
-        </w:rPr>
-        <w:t xml:space="preserve"> </w:t>
-      </w:r>
-      <w:r>
-        <w:rPr>
-          <w:rFonts w:cs="Arial" w:hint="cs"/>
-          <w:rtl/>
-        </w:rPr>
-        <w:t>בזה</w:t>
-      </w:r>
-      <w:r>
-        <w:rPr>
-          <w:rFonts w:hint="cs"/>
-          <w:rtl/>
-        </w:rPr>
-        <w:t>)</w:t>
-      </w:r>
-    </w:p>
-    <w:p>
-      <w:pPr>
-        <w:pStyle w:val="a9"/>
-        <w:numPr>
-          <w:ilvl w:val="0"/>
-          <w:numId w:val="6"/>
-        </w:numPr>
-      </w:pPr>
-      <w:r>
-        <w:rPr>
-          <w:rFonts w:cs="Arial" w:hint="cs"/>
-          <w:rtl/>
-        </w:rPr>
-        <w:t xml:space="preserve">את </w:t>
-      </w:r>
-      <w:r>
-        <w:rPr>
-          <w:rFonts w:cs="Arial" w:hint="cs"/>
-          <w:rtl/>
-        </w:rPr>
-        <w:t>תהלי</w:t>
-      </w:r>
-      <w:r>
-        <w:rPr>
-          <w:rFonts w:cs="Arial" w:hint="cs"/>
-          <w:rtl/>
-        </w:rPr>
-        <w:t xml:space="preserve">כי </w:t>
-      </w:r>
-      <w:r>
-        <w:rPr>
-          <w:rFonts w:cs="Arial" w:hint="cs"/>
-          <w:rtl/>
-        </w:rPr>
-        <w:t>ה</w:t>
-      </w:r>
-      <w:r>
-        <w:rPr>
-          <w:rFonts w:cs="Arial" w:hint="cs"/>
-          <w:rtl/>
-        </w:rPr>
-        <w:t>זרימה</w:t>
-      </w:r>
-      <w:r>
-        <w:rPr>
-          <w:rFonts w:cs="Arial"/>
-          <w:rtl/>
-        </w:rPr>
-        <w:t xml:space="preserve"> </w:t>
-      </w:r>
-      <w:r>
-        <w:rPr>
-          <w:rFonts w:cs="Arial" w:hint="cs"/>
-          <w:rtl/>
-        </w:rPr>
-        <w:t>של</w:t>
-      </w:r>
-      <w:r>
-        <w:rPr>
-          <w:rFonts w:cs="Arial"/>
-          <w:rtl/>
-        </w:rPr>
-        <w:t xml:space="preserve"> </w:t>
-      </w:r>
-      <w:r>
-        <w:rPr>
-          <w:rFonts w:cs="Arial" w:hint="cs"/>
-          <w:rtl/>
-        </w:rPr>
-        <w:t>המערכת</w:t>
-      </w:r>
-      <w:r>
-        <w:rPr>
-          <w:rFonts w:cs="Arial"/>
-          <w:rtl/>
-        </w:rPr>
-        <w:t xml:space="preserve"> </w:t>
-      </w:r>
-      <w:r>
-        <w:rPr>
-          <w:rFonts w:cs="Arial" w:hint="cs"/>
-          <w:rtl/>
-        </w:rPr>
-        <w:t>(</w:t>
-      </w:r>
-      <w:r>
-        <w:rPr>
-          <w:rFonts w:cs="Arial" w:hint="cs"/>
-          <w:rtl/>
-        </w:rPr>
-        <w:t>צריך</w:t>
-      </w:r>
-      <w:r>
-        <w:rPr>
-          <w:rFonts w:cs="Arial"/>
-          <w:rtl/>
-        </w:rPr>
-        <w:t xml:space="preserve"> </w:t>
-      </w:r>
-      <w:r>
-        <w:rPr>
-          <w:rFonts w:cs="Arial" w:hint="cs"/>
-          <w:rtl/>
-        </w:rPr>
-        <w:t>להתחבר</w:t>
-      </w:r>
-      <w:r>
-        <w:rPr>
-          <w:rFonts w:cs="Arial"/>
-          <w:rtl/>
-        </w:rPr>
-        <w:t xml:space="preserve"> </w:t>
-      </w:r>
-      <w:r>
-        <w:rPr>
-          <w:rFonts w:cs="Arial" w:hint="cs"/>
-          <w:rtl/>
-        </w:rPr>
-        <w:t>עם</w:t>
-      </w:r>
-      <w:r>
-        <w:rPr>
-          <w:rFonts w:cs="Arial"/>
-          <w:rtl/>
-        </w:rPr>
-        <w:t xml:space="preserve"> </w:t>
-      </w:r>
-      <w:r>
-        <w:rPr>
-          <w:rFonts w:cs="Arial" w:hint="cs"/>
-          <w:rtl/>
-        </w:rPr>
-        <w:t>משתמש</w:t>
-      </w:r>
-      <w:r>
-        <w:rPr>
-          <w:rFonts w:cs="Arial"/>
-          <w:rtl/>
-        </w:rPr>
-        <w:t xml:space="preserve"> </w:t>
-      </w:r>
-      <w:r>
-        <w:rPr>
-          <w:rFonts w:cs="Arial" w:hint="cs"/>
-          <w:rtl/>
-        </w:rPr>
-        <w:t>לפני</w:t>
-      </w:r>
-      <w:r>
-        <w:rPr>
-          <w:rFonts w:cs="Arial"/>
-          <w:rtl/>
-        </w:rPr>
-        <w:t xml:space="preserve"> </w:t>
-      </w:r>
-      <w:r>
-        <w:rPr>
-          <w:rFonts w:cs="Arial" w:hint="cs"/>
-          <w:rtl/>
-        </w:rPr>
-        <w:t>ביצוע</w:t>
-      </w:r>
-      <w:r>
-        <w:rPr>
-          <w:rFonts w:cs="Arial"/>
-          <w:rtl/>
-        </w:rPr>
-        <w:t xml:space="preserve"> </w:t>
-      </w:r>
-      <w:r>
-        <w:rPr>
-          <w:rFonts w:cs="Arial" w:hint="cs"/>
-          <w:rtl/>
-        </w:rPr>
-        <w:t>הבדיקה</w:t>
-      </w:r>
-      <w:r>
-        <w:rPr>
-          <w:rFonts w:cs="Arial"/>
-          <w:rtl/>
-        </w:rPr>
-        <w:t xml:space="preserve">? </w:t>
-      </w:r>
-      <w:r>
-        <w:rPr>
-          <w:rFonts w:cs="Arial" w:hint="cs"/>
-          <w:rtl/>
-        </w:rPr>
-        <w:t>יש</w:t>
-      </w:r>
-      <w:r>
-        <w:rPr>
-          <w:rFonts w:cs="Arial"/>
-          <w:rtl/>
-        </w:rPr>
-        <w:t xml:space="preserve"> </w:t>
-      </w:r>
-      <w:r>
-        <w:t>redirect</w:t>
-      </w:r>
-      <w:r>
-        <w:rPr>
-          <w:rFonts w:cs="Arial"/>
-          <w:rtl/>
-        </w:rPr>
-        <w:t xml:space="preserve">? </w:t>
-      </w:r>
-      <w:r>
-        <w:rPr>
-          <w:rFonts w:cs="Arial" w:hint="cs"/>
-          <w:rtl/>
-        </w:rPr>
-        <w:t>יש</w:t>
-      </w:r>
-      <w:r>
-        <w:rPr>
-          <w:rFonts w:cs="Arial"/>
-          <w:rtl/>
-        </w:rPr>
-        <w:t xml:space="preserve"> </w:t>
-      </w:r>
-      <w:r>
-        <w:rPr>
-          <w:rFonts w:cs="Arial" w:hint="cs"/>
-          <w:rtl/>
-        </w:rPr>
-        <w:t>צעדים</w:t>
-      </w:r>
-      <w:r>
-        <w:rPr>
-          <w:rFonts w:cs="Arial"/>
-          <w:rtl/>
-        </w:rPr>
-        <w:t xml:space="preserve"> </w:t>
-      </w:r>
-      <w:r>
-        <w:rPr>
-          <w:rFonts w:cs="Arial" w:hint="cs"/>
-          <w:rtl/>
-        </w:rPr>
-        <w:t>קבועים</w:t>
-      </w:r>
-      <w:r>
-        <w:rPr>
-          <w:rFonts w:cs="Arial"/>
-          <w:rtl/>
-        </w:rPr>
-        <w:t>?</w:t>
-      </w:r>
-      <w:r>
-        <w:rPr>
-          <w:rFonts w:hint="cs"/>
-          <w:rtl/>
-        </w:rPr>
-        <w:t>)</w:t>
-      </w:r>
-    </w:p>
-    <w:p>
-      <w:pPr>
-        <w:pStyle w:val="a9"/>
-        <w:numPr>
-          <w:ilvl w:val="0"/>
-          <w:numId w:val="6"/>
-        </w:numPr>
-      </w:pPr>
-      <w:r>
-        <w:rPr>
-          <w:rFonts w:hint="cs"/>
-          <w:rtl/>
-        </w:rPr>
-        <w:t>קונבנציות</w:t>
-      </w:r>
-      <w:r>
-        <w:rPr>
-          <w:rFonts w:cs="Arial"/>
-          <w:rtl/>
-        </w:rPr>
-        <w:t xml:space="preserve"> (</w:t>
-      </w:r>
-      <w:r>
-        <w:rPr>
-          <w:rFonts w:cs="Arial" w:hint="cs"/>
-          <w:rtl/>
-        </w:rPr>
-        <w:t xml:space="preserve">שמירה על מבנה הקוד, שימוש </w:t>
-      </w:r>
-      <w:r>
-        <w:rPr>
-          <w:rFonts w:cs="Arial" w:hint="cs"/>
-          <w:rtl/>
-        </w:rPr>
-        <w:t>ב</w:t>
-      </w:r>
-      <w:r>
-        <w:rPr>
-          <w:rFonts w:cs="Arial" w:hint="cs"/>
-          <w:rtl/>
-        </w:rPr>
-        <w:t xml:space="preserve"> - </w:t>
-      </w:r>
-      <w:r>
-        <w:rPr>
-          <w:rFonts w:cs="Arial"/>
-        </w:rPr>
-        <w:t>helpers/fixtures</w:t>
-      </w:r>
-      <w:r>
-        <w:rPr>
-          <w:rFonts w:cs="Arial"/>
-          <w:rtl/>
-        </w:rPr>
-        <w:t>)</w:t>
-      </w:r>
-    </w:p>
-    <w:p>
-      <w:pPr>
-        <w:pStyle w:val="4"/>
-        <w:rPr>
-          <w:rtl/>
-        </w:rPr>
-      </w:pPr>
-      <w:r>
-        <w:rPr>
-          <w:rFonts w:hint="cs"/>
-          <w:rtl/>
-        </w:rPr>
-        <w:t xml:space="preserve">טיפים </w:t>
-      </w:r>
-      <w:proofErr w:type="spellStart"/>
-      <w:r>
-        <w:rPr>
-          <w:rFonts w:hint="cs"/>
-          <w:rtl/>
-        </w:rPr>
-        <w:t>לאיך</w:t>
-      </w:r>
-      <w:proofErr w:type="spellEnd"/>
-      <w:r>
-        <w:rPr>
-          <w:rFonts w:hint="cs"/>
-          <w:rtl/>
-        </w:rPr>
-        <w:t xml:space="preserve"> לכתוב קובץ </w:t>
-      </w:r>
-      <w:proofErr w:type="spellStart"/>
-      <w:r>
-        <w:t>seed.spec</w:t>
-      </w:r>
-      <w:proofErr w:type="spellEnd"/>
-      <w:r>
-        <w:rPr>
-          <w:rFonts w:hint="cs"/>
-          <w:rtl/>
-        </w:rPr>
-        <w:t xml:space="preserve"> טוב</w:t>
-      </w:r>
-    </w:p>
-    <w:p>
-      <w:pPr>
-        <w:rPr>
-          <w:rFonts w:cs="Arial"/>
-          <w:rtl/>
-        </w:rPr>
-      </w:pPr>
-      <w:r>
-        <w:rPr>
-          <w:rFonts w:cs="Arial" w:hint="cs"/>
-          <w:rtl/>
-        </w:rPr>
-        <w:t>הקובץ שאותו תכתבו יהיה תלוי במה שאתם רוצים שהסוכנים יבדקו.</w:t>
-      </w:r>
-    </w:p>
-    <w:p>
-      <w:pPr>
-        <w:rPr>
-          <w:rFonts w:cs="Arial"/>
-          <w:rtl/>
-        </w:rPr>
-      </w:pPr>
-      <w:r>
-        <w:rPr>
-          <w:rFonts w:cs="Arial" w:hint="cs"/>
-          <w:rtl/>
-        </w:rPr>
-        <w:t>נניח שיש לכם במערכת דף התחברות, אבל אתם לא רוצים שהסוכן יבדוק את דף ההתחברות, אלא רק את הדף שאחריו</w:t>
-      </w:r>
-    </w:p>
-    <w:p>
-      <w:pPr>
-        <w:rPr>
-          <w:rFonts w:cs="Arial"/>
-          <w:rtl/>
-        </w:rPr>
-      </w:pPr>
-      <w:r>
-        <w:rPr>
-          <w:rFonts w:cs="Arial" w:hint="cs"/>
-          <w:rtl/>
-        </w:rPr>
-        <w:t xml:space="preserve">חשוב בקובץ ה - </w:t>
-      </w:r>
-      <w:r>
-        <w:rPr>
-          <w:rFonts w:cs="Arial"/>
-        </w:rPr>
-        <w:t>seed</w:t>
-      </w:r>
-      <w:r>
-        <w:rPr>
-          <w:rFonts w:cs="Arial" w:hint="cs"/>
-          <w:rtl/>
-        </w:rPr>
-        <w:t xml:space="preserve"> לבצע את ההתחברות כרגיל, כדי שהסוכן יבין שזה לא התהליך שהוא אמור לבדוק, אלא</w:t>
-      </w:r>
-      <w:r>
-        <w:rPr>
-          <w:rFonts w:cs="Arial" w:hint="cs"/>
-          <w:rtl/>
-        </w:rPr>
-        <w:t xml:space="preserve"> רק</w:t>
-      </w:r>
-      <w:r>
-        <w:rPr>
-          <w:rFonts w:cs="Arial" w:hint="cs"/>
-          <w:rtl/>
-        </w:rPr>
-        <w:t xml:space="preserve"> את הדף שמגיע אחריו.</w:t>
-      </w:r>
-    </w:p>
-    <w:p>
-      <w:pPr>
-        <w:rPr>
-          <w:rFonts w:cs="Arial"/>
-          <w:rtl/>
-        </w:rPr>
-      </w:pPr>
-      <w:r>
-        <w:rPr>
-          <w:rFonts w:cs="Arial" w:hint="cs"/>
-          <w:rtl/>
-        </w:rPr>
-        <w:t>עוד נקודות לכתיבת קובץ טוב:</w:t>
-      </w:r>
-    </w:p>
-    <w:p>
-      <w:pPr>
-        <w:pStyle w:val="a9"/>
-        <w:numPr>
-          <w:ilvl w:val="0"/>
-          <w:numId w:val="35"/>
-        </w:numPr>
-        <w:rPr>
-          <w:rtl/>
-        </w:rPr>
-      </w:pPr>
-      <w:r>
-        <w:rPr>
-          <w:rFonts w:cs="Arial" w:hint="cs"/>
-          <w:rtl/>
-        </w:rPr>
-        <w:t xml:space="preserve">לכלול </w:t>
-      </w:r>
-      <w:r>
-        <w:rPr>
-          <w:rFonts w:hint="cs"/>
-          <w:rtl/>
-        </w:rPr>
-        <w:t>תהליך זרימה</w:t>
-      </w:r>
-      <w:r>
-        <w:rPr>
-          <w:rFonts w:cs="Arial"/>
-          <w:rtl/>
-        </w:rPr>
-        <w:t xml:space="preserve"> </w:t>
-      </w:r>
-      <w:r>
-        <w:rPr>
-          <w:rFonts w:cs="Arial" w:hint="cs"/>
-          <w:rtl/>
-        </w:rPr>
-        <w:t>אמיתי</w:t>
-      </w:r>
-      <w:r>
-        <w:rPr>
-          <w:rFonts w:cs="Arial"/>
-          <w:rtl/>
-        </w:rPr>
-        <w:t xml:space="preserve"> </w:t>
-      </w:r>
-      <w:r>
-        <w:rPr>
-          <w:rFonts w:cs="Arial" w:hint="cs"/>
-          <w:rtl/>
-        </w:rPr>
-        <w:t>של המערכת</w:t>
-      </w:r>
-    </w:p>
-    <w:p>
-      <w:pPr>
-        <w:pStyle w:val="a9"/>
-        <w:numPr>
-          <w:ilvl w:val="0"/>
-          <w:numId w:val="35"/>
-        </w:numPr>
-        <w:rPr>
-          <w:rtl/>
-        </w:rPr>
-      </w:pPr>
-      <w:r>
-        <w:rPr>
-          <w:rFonts w:cs="Arial" w:hint="cs"/>
-          <w:rtl/>
-        </w:rPr>
-        <w:t>להשתמש</w:t>
-      </w:r>
-      <w:r>
-        <w:rPr>
-          <w:rFonts w:cs="Arial"/>
-          <w:rtl/>
-        </w:rPr>
-        <w:t xml:space="preserve"> </w:t>
-      </w:r>
-      <w:r>
-        <w:rPr>
-          <w:rFonts w:cs="Arial" w:hint="cs"/>
-          <w:rtl/>
-        </w:rPr>
-        <w:t>בזיהויים</w:t>
-      </w:r>
-      <w:r>
-        <w:rPr>
-          <w:rFonts w:cs="Arial"/>
-          <w:rtl/>
-        </w:rPr>
-        <w:t xml:space="preserve"> </w:t>
-      </w:r>
-      <w:r>
-        <w:rPr>
-          <w:rFonts w:cs="Arial" w:hint="cs"/>
-          <w:rtl/>
-        </w:rPr>
-        <w:t>יציבים</w:t>
-      </w:r>
-    </w:p>
-    <w:p>
-      <w:pPr>
-        <w:pStyle w:val="a9"/>
-        <w:numPr>
-          <w:ilvl w:val="0"/>
-          <w:numId w:val="35"/>
-        </w:numPr>
-        <w:rPr>
-          <w:rtl/>
-        </w:rPr>
-      </w:pPr>
-      <w:r>
-        <w:rPr>
-          <w:rFonts w:cs="Arial" w:hint="cs"/>
-          <w:rtl/>
-        </w:rPr>
-        <w:t>לכתוב</w:t>
-      </w:r>
-      <w:r>
-        <w:rPr>
-          <w:rFonts w:cs="Arial"/>
-          <w:rtl/>
-        </w:rPr>
-        <w:t xml:space="preserve"> </w:t>
-      </w:r>
-      <w:r>
-        <w:rPr>
-          <w:rFonts w:cs="Arial" w:hint="cs"/>
-          <w:rtl/>
-        </w:rPr>
-        <w:t>קוד</w:t>
-      </w:r>
-      <w:r>
-        <w:rPr>
-          <w:rFonts w:cs="Arial"/>
-          <w:rtl/>
-        </w:rPr>
-        <w:t xml:space="preserve"> </w:t>
-      </w:r>
-      <w:r>
-        <w:rPr>
-          <w:rFonts w:cs="Arial" w:hint="cs"/>
-          <w:rtl/>
-        </w:rPr>
-        <w:t>נקי</w:t>
-      </w:r>
-      <w:r>
-        <w:rPr>
-          <w:rFonts w:cs="Arial"/>
-          <w:rtl/>
-        </w:rPr>
-        <w:t xml:space="preserve"> </w:t>
-      </w:r>
-      <w:r>
-        <w:rPr>
-          <w:rFonts w:cs="Arial" w:hint="cs"/>
-          <w:rtl/>
-        </w:rPr>
-        <w:t>וברור</w:t>
-      </w:r>
-      <w:r>
-        <w:rPr>
-          <w:rFonts w:hint="cs"/>
-          <w:rtl/>
-        </w:rPr>
-        <w:t>, שיממש את הקונבנציות של התשתית שלכם</w:t>
-      </w:r>
-    </w:p>
-    <w:p>
-      <w:pPr>
-        <w:pStyle w:val="a9"/>
-        <w:numPr>
-          <w:ilvl w:val="0"/>
-          <w:numId w:val="35"/>
-        </w:numPr>
-        <w:rPr>
-          <w:rtl/>
-        </w:rPr>
-      </w:pPr>
-      <w:r>
-        <w:rPr>
-          <w:rFonts w:cs="Arial" w:hint="cs"/>
-          <w:rtl/>
-        </w:rPr>
-        <w:t>להראות</w:t>
-      </w:r>
-      <w:r>
-        <w:rPr>
-          <w:rFonts w:cs="Arial"/>
-          <w:rtl/>
-        </w:rPr>
-        <w:t xml:space="preserve"> </w:t>
-      </w:r>
-      <w:r>
-        <w:t>patterns</w:t>
-      </w:r>
-      <w:r>
-        <w:rPr>
-          <w:rFonts w:cs="Arial"/>
-          <w:rtl/>
-        </w:rPr>
-        <w:t xml:space="preserve"> </w:t>
-      </w:r>
-      <w:r>
-        <w:rPr>
-          <w:rFonts w:cs="Arial" w:hint="cs"/>
-          <w:rtl/>
-        </w:rPr>
-        <w:t>שחוזרים</w:t>
-      </w:r>
-      <w:r>
-        <w:rPr>
-          <w:rFonts w:cs="Arial"/>
-          <w:rtl/>
-        </w:rPr>
-        <w:t xml:space="preserve"> </w:t>
-      </w:r>
-      <w:r>
-        <w:rPr>
-          <w:rFonts w:cs="Arial" w:hint="cs"/>
-          <w:rtl/>
-        </w:rPr>
-        <w:t>על</w:t>
-      </w:r>
-      <w:r>
-        <w:rPr>
-          <w:rFonts w:cs="Arial"/>
-          <w:rtl/>
-        </w:rPr>
-        <w:t xml:space="preserve"> </w:t>
-      </w:r>
-      <w:r>
-        <w:rPr>
-          <w:rFonts w:cs="Arial" w:hint="cs"/>
-          <w:rtl/>
-        </w:rPr>
-        <w:t>עצמם</w:t>
-      </w:r>
-    </w:p>
-    <w:p>
-      <w:pPr>
-        <w:rPr>
-          <w:rtl/>
-        </w:rPr>
-      </w:pPr>
-      <w:r>
-        <w:rPr>
-          <w:rFonts w:ascii="Segoe UI Emoji" w:hAnsi="Segoe UI Emoji" w:cs="Arial" w:hint="cs"/>
-          <w:rtl/>
-        </w:rPr>
-        <w:t>ממה</w:t>
-      </w:r>
-      <w:r>
-        <w:rPr>
-          <w:rFonts w:ascii="Segoe UI Emoji" w:hAnsi="Segoe UI Emoji" w:cs="Arial" w:hint="cs"/>
-          <w:rtl/>
-        </w:rPr>
-        <w:t xml:space="preserve"> רצוי</w:t>
-      </w:r>
-      <w:r>
-        <w:rPr>
-          <w:rFonts w:ascii="Segoe UI Emoji" w:hAnsi="Segoe UI Emoji" w:cs="Arial" w:hint="cs"/>
-          <w:rtl/>
-        </w:rPr>
-        <w:t xml:space="preserve"> להימנע</w:t>
-      </w:r>
-      <w:r>
-        <w:rPr>
-          <w:rFonts w:cs="Arial"/>
-          <w:rtl/>
-        </w:rPr>
-        <w:t>:</w:t>
-      </w:r>
-    </w:p>
-    <w:p>
-      <w:pPr>
-        <w:pStyle w:val="a9"/>
-        <w:numPr>
-          <w:ilvl w:val="0"/>
-          <w:numId w:val="36"/>
-        </w:numPr>
-      </w:pPr>
-      <w:r>
-        <w:rPr>
-          <w:rFonts w:cs="Arial" w:hint="cs"/>
-          <w:rtl/>
-        </w:rPr>
-        <w:t>כתיבת בדיקות שיכשלו, או שהן לא יציבות (</w:t>
-      </w:r>
-      <w:r>
-        <w:t>flaky</w:t>
-      </w:r>
-      <w:r>
-        <w:rPr>
-          <w:rFonts w:hint="cs"/>
-          <w:rtl/>
-        </w:rPr>
-        <w:t>)</w:t>
-      </w:r>
-    </w:p>
-    <w:p>
-      <w:pPr>
-        <w:pStyle w:val="a9"/>
-        <w:numPr>
-          <w:ilvl w:val="0"/>
-          <w:numId w:val="36"/>
-        </w:numPr>
-      </w:pPr>
-      <w:r>
-        <w:rPr>
-          <w:rFonts w:cs="Arial" w:hint="cs"/>
-          <w:rtl/>
-        </w:rPr>
-        <w:t>שימוש</w:t>
-      </w:r>
-      <w:r>
-        <w:rPr>
-          <w:rFonts w:cs="Arial"/>
-          <w:rtl/>
-        </w:rPr>
-        <w:t xml:space="preserve"> </w:t>
-      </w:r>
-      <w:r>
-        <w:rPr>
-          <w:rFonts w:cs="Arial" w:hint="cs"/>
-          <w:rtl/>
-        </w:rPr>
-        <w:t>ב</w:t>
-      </w:r>
-      <w:r>
-        <w:rPr>
-          <w:rFonts w:cs="Arial" w:hint="cs"/>
-          <w:rtl/>
-        </w:rPr>
-        <w:t xml:space="preserve"> - </w:t>
-      </w:r>
-      <w:r>
-        <w:t>timeouts</w:t>
-      </w:r>
-      <w:r>
-        <w:rPr>
-          <w:rFonts w:hint="cs"/>
-          <w:rtl/>
-        </w:rPr>
-        <w:t xml:space="preserve"> שלא לצורך</w:t>
-      </w:r>
-      <w:r>
-        <w:rPr>
-          <w:rFonts w:hint="cs"/>
-          <w:rtl/>
-        </w:rPr>
-        <w:t xml:space="preserve"> (הסוכנים עשויים לשכפל את הלוגיקה הזאת וזה עשוי להאט משמעותית את הבדיקות)</w:t>
-      </w:r>
-    </w:p>
-    <w:p>
-      <w:pPr>
-        <w:pStyle w:val="a9"/>
-        <w:numPr>
-          <w:ilvl w:val="0"/>
-          <w:numId w:val="36"/>
-        </w:numPr>
-        <w:rPr>
-          <w:rtl/>
-        </w:rPr>
-      </w:pPr>
-      <w:r>
-        <w:rPr>
-          <w:rFonts w:cs="Arial" w:hint="cs"/>
-          <w:rtl/>
-        </w:rPr>
-        <w:t>לוגיקה</w:t>
-      </w:r>
-      <w:r>
-        <w:rPr>
-          <w:rFonts w:cs="Arial"/>
-          <w:rtl/>
-        </w:rPr>
-        <w:t xml:space="preserve"> </w:t>
-      </w:r>
-      <w:r>
-        <w:rPr>
-          <w:rFonts w:cs="Arial" w:hint="cs"/>
-          <w:rtl/>
-        </w:rPr>
-        <w:t>מסובכת</w:t>
-      </w:r>
-      <w:r>
-        <w:rPr>
-          <w:rFonts w:cs="Arial"/>
-          <w:rtl/>
-        </w:rPr>
-        <w:t xml:space="preserve"> </w:t>
-      </w:r>
-      <w:r>
-        <w:rPr>
-          <w:rFonts w:cs="Arial" w:hint="cs"/>
-          <w:rtl/>
-        </w:rPr>
-        <w:t>מדי</w:t>
-      </w:r>
-      <w:r>
-        <w:rPr>
-          <w:rFonts w:hint="cs"/>
-          <w:rtl/>
-        </w:rPr>
-        <w:t xml:space="preserve"> (התניית בדיקות פשוטות יחסית</w:t>
-      </w:r>
-      <w:r>
-        <w:rPr>
-          <w:rFonts w:hint="cs"/>
-          <w:rtl/>
-        </w:rPr>
-        <w:t xml:space="preserve"> ולא מסובכות</w:t>
-      </w:r>
-      <w:r>
-        <w:rPr>
-          <w:rFonts w:hint="cs"/>
-          <w:rtl/>
-        </w:rPr>
-        <w:t>)</w:t>
-      </w:r>
-    </w:p>
-    <w:p>
-      <w:pPr>
-        <w:rPr>
-          <w:rtl/>
-        </w:rPr>
-      </w:pPr>
-    </w:p>
-    <w:p>
-      <w:pPr>
-        <w:rPr>
-          <w:rtl/>
-        </w:rPr>
-      </w:pPr>
-    </w:p>
-    <w:p>
-      <w:pPr>
-        <w:rPr>
-          <w:rtl/>
-        </w:rPr>
-      </w:pPr>
-    </w:p>
-    <w:p>
-      <w:pPr>
-        <w:rPr>
-          <w:rtl/>
-        </w:rPr>
-      </w:pPr>
-    </w:p>
-    <w:p>
-      <w:pPr>
-        <w:rPr>
-          <w:rtl/>
-        </w:rPr>
-      </w:pPr>
-    </w:p>
-    <w:p>
-      <w:pPr>
-        <w:rPr>
-          <w:rtl/>
-        </w:rPr>
-      </w:pPr>
-    </w:p>
-    <w:p>
-      <w:pPr>
-        <w:rPr>
-          <w:rtl/>
-        </w:rPr>
-      </w:pPr>
-    </w:p>
-    <w:p>
-      <w:pPr>
-        <w:rPr>
-          <w:rtl/>
-        </w:rPr>
-      </w:pPr>
-    </w:p>
-    <w:p>
-      <w:pPr>
-        <w:rPr>
-          <w:rtl/>
-        </w:rPr>
-      </w:pPr>
-    </w:p>
-    <w:p>
-      <w:pPr>
-        <w:rPr>
-          <w:rtl/>
-        </w:rPr>
-      </w:pPr>
-    </w:p>
-    <w:p>
-      <w:pPr>
-        <w:rPr>
-          <w:rtl/>
-        </w:rPr>
-      </w:pPr>
-    </w:p>
-    <w:p>
-      <w:pPr>
-        <w:rPr>
-          <w:rtl/>
-        </w:rPr>
-      </w:pPr>
-    </w:p>
-    <w:p>
-      <w:pPr>
-        <w:rPr>
-          <w:rtl/>
-        </w:rPr>
-      </w:pPr>
-    </w:p>
-    <w:p>
-      <w:pPr>
-        <w:rPr>
-          <w:rFonts w:hint="cs"/>
+    </w:p>
+    <w:p>
+      <w:pPr>
+        <w:rPr>
+          <w:rtl/>
+        </w:rPr>
+      </w:pPr>
+    </w:p>
+    <w:p>
+      <w:pPr>
+        <w:rPr>
+          <w:rtl/>
+        </w:rPr>
+      </w:pPr>
+    </w:p>
+    <w:p>
+      <w:pPr>
+        <w:rPr>
+          <w:rtl/>
+        </w:rPr>
+      </w:pPr>
+    </w:p>
+    <w:p>
+      <w:pPr>
+        <w:rPr>
+          <w:rtl/>
+        </w:rPr>
+      </w:pPr>
+    </w:p>
+    <w:p>
+      <w:pPr>
+        <w:rPr>
+          <w:rtl/>
+        </w:rPr>
+      </w:pPr>
+    </w:p>
+    <w:p>
+      <w:pPr>
+        <w:rPr>
+          <w:rtl/>
+        </w:rPr>
+      </w:pPr>
+    </w:p>
+    <w:p>
+      <w:pPr>
+        <w:rPr>
           <w:rtl/>
         </w:rPr>
       </w:pPr>
@@ -15278,7 +13256,7 @@
           <w:rtl/>
         </w:rPr>
       </w:pPr>
-      <w:bookmarkStart w:id="25" w:name="_Toc224653127"/>
+      <w:bookmarkStart w:id="25" w:name="_Toc224718598"/>
       <w:r>
         <w:rPr>
           <w:rFonts w:hint="cs"/>
@@ -17102,7 +15080,6 @@
     <w:p>
       <w:pPr>
         <w:rPr>
-          <w:rFonts w:hint="cs"/>
           <w:rtl/>
         </w:rPr>
       </w:pPr>
@@ -17115,7 +15092,7 @@
         </w:rPr>
       </w:pPr>
       <w:bookmarkStart w:id="26" w:name="_דוגמא_לכתיבת_prompt"/>
-      <w:bookmarkStart w:id="27" w:name="_Toc224653128"/>
+      <w:bookmarkStart w:id="27" w:name="_Toc224718599"/>
       <w:bookmarkEnd w:id="26"/>
       <w:r>
         <w:rPr>
@@ -18169,7 +16146,6 @@
     <w:p>
       <w:pPr>
         <w:rPr>
-          <w:rFonts w:hint="cs"/>
           <w:rtl/>
         </w:rPr>
       </w:pPr>
@@ -22975,6 +20951,7 @@
   <w:style w:type="character" w:default="1" w:styleId="a0">
     <w:name w:val="Default Paragraph Font"/>
     <w:uiPriority w:val="1"/>
+    <w:semiHidden/>
     <w:unhideWhenUsed/>
   </w:style>
   <w:style w:type="table" w:default="1" w:styleId="a1">

</xml_diff>